<commit_message>
Equation 2 line breaking fix
</commit_message>
<xml_diff>
--- a/report/IT5082_Assignment_Report.docx
+++ b/report/IT5082_Assignment_Report.docx
@@ -437,18 +437,16 @@
                 <w:color w:val="244061" w:themeColor="accent1" w:themeShade="80"/>
                 <w:sz w:val="24"/>
               </w:rPr>
-              <w:t xml:space="preserve">Dhammika </w:t>
-            </w:r>
-            <w:proofErr w:type="spellStart"/>
+              <w:t>K.V. D</w:t>
+            </w:r>
             <w:r>
               <w:rPr>
                 <w:bCs/>
                 <w:color w:val="244061" w:themeColor="accent1" w:themeShade="80"/>
                 <w:sz w:val="24"/>
               </w:rPr>
-              <w:t>Kekulawala</w:t>
-            </w:r>
-            <w:proofErr w:type="spellEnd"/>
+              <w:t xml:space="preserve"> Kekulawala</w:t>
+            </w:r>
           </w:p>
         </w:tc>
       </w:tr>
@@ -4216,15 +4214,7 @@
     </w:p>
     <w:p>
       <w:r>
-        <w:t xml:space="preserve">The Nurse Scheduling Problem requires assigning ward staff to daily shifts over a planning horizon while strictly satisfying labor regulations, covering shift demands, and optimizing employee preferences. This report formalizes the problem mathematically and evaluates two distinct solution methodologies: (1) an exact binary Integer Linear Programming (ILP) approach, implemented in </w:t>
-      </w:r>
-      <w:proofErr w:type="spellStart"/>
-      <w:r>
-        <w:t>PuLP</w:t>
-      </w:r>
-      <w:proofErr w:type="spellEnd"/>
-      <w:r>
-        <w:t xml:space="preserve"> and solved via CBC, and (2) a penalty-based Genetic Algorithm (GA), implemented via DEAP. Both methods were benchmarked across six published problem instances spanning 112 to 16,800 binary decision variables. The exact ILP solver verified global optimality within two seconds on the two smallest instances (objective values 607 and 828), but encountered severe scalability limits on the largest instances, failing to produce a feasible roster within a 300-second cutoff. Conversely, the GA returned candidate schedules across all instances, but solution feasibility degraded significantly on larger problem sizes under the baseline penalty configuration. We detail both implementations, compare the trade-offs between exact optimality and heuristic scalability, and discuss the parameter calibration necessary for an equitable runtime comparison.</w:t>
+        <w:t>The Nurse Scheduling Problem requires assigning ward staff to daily shifts over a planning horizon while strictly satisfying labor regulations, covering shift demands, and optimizing employee preferences. This report formalizes the problem mathematically and evaluates two distinct solution methodologies: (1) an exact binary Integer Linear Programming (ILP) approach, implemented in PuLP and solved via CBC, and (2) a penalty-based Genetic Algorithm (GA), implemented via DEAP. Both methods were benchmarked across six published problem instances spanning 112 to 16,800 binary decision variables. The exact ILP solver verified global optimality within two seconds on the two smallest instances (objective values 607 and 828), but encountered severe scalability limits on the largest instances, failing to produce a feasible roster within a 300-second cutoff. Conversely, the GA returned candidate schedules across all instances, but solution feasibility degraded significantly on larger problem sizes under the baseline penalty configuration. We detail both implementations, compare the trade-offs between exact optimality and heuristic scalability, and discuss the parameter calibration necessary for an equitable runtime comparison.</w:t>
       </w:r>
       <w:r>
         <w:br w:type="page"/>
@@ -4298,15 +4288,7 @@
     </w:p>
     <w:p>
       <w:r>
-        <w:t xml:space="preserve">Hospitals operate around the clock, so the work of a ward is divided into shifts (for example early, day, late and night). Every shift needs a minimum number of nurses to keep patients safe; too few is a clinical and legal risk, while too many wastes scarce and expensive staff. At the same time each nurse is a person with a contract, a legal limit on working hours, a need for rest between shifts, and preferences about which days to work. A roster is the timetable that assigns every nurse to a shift or a day off for each day in a planning period, typically two to four weeks. In practice, rosters are still often produced by a head nurse by hand, taking many hours per period, and the result is frequently either infeasible with respect to some </w:t>
-      </w:r>
-      <w:proofErr w:type="gramStart"/>
-      <w:r>
-        <w:t>rule</w:t>
-      </w:r>
-      <w:proofErr w:type="gramEnd"/>
-      <w:r>
-        <w:t xml:space="preserve"> or unfair to some nurses. Nurse rostering is one of the best-known applications of optimization in health-care management, and it is also a computationally hard problem: the number of possible rosters grows exponentially with the number of nurses and days, and the underlying problem class is NP-hard. This makes it a natural setting in which to study this course's central trade-off — guaranteed-optimal exact methods versus scalable heuristic methods — on a problem with real, verifiable data.</w:t>
+        <w:t>Hospitals operate around the clock, so the work of a ward is divided into shifts (for example early, day, late and night). Every shift needs a minimum number of nurses to keep patients safe; too few is a clinical and legal risk, while too many wastes scarce and expensive staff. At the same time each nurse is a person with a contract, a legal limit on working hours, a need for rest between shifts, and preferences about which days to work. A roster is the timetable that assigns every nurse to a shift or a day off for each day in a planning period, typically two to four weeks. In practice, rosters are still often produced by a head nurse by hand, taking many hours per period, and the result is frequently either infeasible with respect to some rule or unfair to some nurses. Nurse rostering is one of the best-known applications of optimization in health-care management, and it is also a computationally hard problem: the number of possible rosters grows exponentially with the number of nurses and days, and the underlying problem class is NP-hard. This makes it a natural setting in which to study this course's central trade-off — guaranteed-optimal exact methods versus scalable heuristic methods — on a problem with real, verifiable data.</w:t>
       </w:r>
     </w:p>
     <w:p/>
@@ -4328,31 +4310,7 @@
     </w:p>
     <w:p>
       <w:r>
-        <w:t xml:space="preserve">A ward employs a fixed set of nurses. The planning horizon is a whole number of weeks (14 to 364 days across the published benchmark), and the first day is always </w:t>
-      </w:r>
-      <w:proofErr w:type="gramStart"/>
-      <w:r>
-        <w:t>a Monday</w:t>
-      </w:r>
-      <w:proofErr w:type="gramEnd"/>
-      <w:r>
-        <w:t xml:space="preserve">. Each day is divided into several shift types (Instance 1 has one type; larger instances have up to 32). For every day and shift type the ward knows how many nurses are required. Each nurse has an individual contract that limits how much and how they may work, a list of days on which they are unavailable, and a list of requests to work or not to work </w:t>
-      </w:r>
-      <w:proofErr w:type="gramStart"/>
-      <w:r>
-        <w:t>particular shifts</w:t>
-      </w:r>
-      <w:proofErr w:type="gramEnd"/>
-      <w:r>
-        <w:t xml:space="preserve">, each with an </w:t>
-      </w:r>
-      <w:proofErr w:type="gramStart"/>
-      <w:r>
-        <w:t>importance</w:t>
-      </w:r>
-      <w:proofErr w:type="gramEnd"/>
-      <w:r>
-        <w:t xml:space="preserve"> weight. For every nurse, every day and every shift type, the model must decide whether that nurse works that shift — in other words, choose a complete roster for the whole horizon.</w:t>
+        <w:t>A ward employs a fixed set of nurses. The planning horizon is a whole number of weeks (14 to 364 days across the published benchmark), and the first day is always a Monday. Each day is divided into several shift types (Instance 1 has one type; larger instances have up to 32). For every day and shift type the ward knows how many nurses are required. Each nurse has an individual contract that limits how much and how they may work, a list of days on which they are unavailable, and a list of requests to work or not to work particular shifts, each with an importance weight. For every nurse, every day and every shift type, the model must decide whether that nurse works that shift — in other words, choose a complete roster for the whole horizon.</w:t>
       </w:r>
     </w:p>
     <w:p/>
@@ -4382,15 +4340,7 @@
     </w:p>
     <w:p>
       <w:r>
-        <w:t>A roster is feasible only if it satisfies every rule below, for every nurse. They come directly from the benchmark definition (</w:t>
-      </w:r>
-      <w:proofErr w:type="spellStart"/>
-      <w:r>
-        <w:t>Curtois</w:t>
-      </w:r>
-      <w:proofErr w:type="spellEnd"/>
-      <w:r>
-        <w:t xml:space="preserve"> &amp; Qu, 2014).</w:t>
+        <w:t>A roster is feasible only if it satisfies every rule below, for every nurse. They come directly from the benchmark definition (Curtois &amp; Qu, 2014).</w:t>
       </w:r>
     </w:p>
     <w:p>
@@ -4501,13 +4451,8 @@
         </w:rPr>
         <w:t xml:space="preserve">H8. </w:t>
       </w:r>
-      <w:proofErr w:type="gramStart"/>
-      <w:r>
-        <w:t>Maximum weekends —</w:t>
-      </w:r>
-      <w:proofErr w:type="gramEnd"/>
-      <w:r>
-        <w:t xml:space="preserve"> a nurse may work at most a stated number of weekends (Saturday or Sunday counts as that weekend worked).</w:t>
+      <w:r>
+        <w:t>Maximum weekends — a nurse may work at most a stated number of weekends (Saturday or Sunday counts as that weekend worked).</w:t>
       </w:r>
     </w:p>
     <w:p>
@@ -4625,15 +4570,7 @@
     </w:p>
     <w:p>
       <w:r>
-        <w:t xml:space="preserve">Find a feasible roster that </w:t>
-      </w:r>
-      <w:proofErr w:type="spellStart"/>
-      <w:r>
-        <w:t>minimises</w:t>
-      </w:r>
-      <w:proofErr w:type="spellEnd"/>
-      <w:r>
-        <w:t xml:space="preserve"> the total penalty: the sum of all unmet shift-on request weights, all violated shift-off request weights, and all under- and over-cover penalties. A penalty of zero is a perfect roster; a lower value is always a better roster. The exact equation is given in Section 3.2.</w:t>
+        <w:t>Find a feasible roster that minimises the total penalty: the sum of all unmet shift-on request weights, all violated shift-off request weights, and all under- and over-cover penalties. A penalty of zero is a perfect roster; a lower value is always a better roster. The exact equation is given in Section 3.2.</w:t>
       </w:r>
     </w:p>
     <w:p/>
@@ -4678,23 +4615,7 @@
         <w:pStyle w:val="ListBullet"/>
       </w:pPr>
       <w:r>
-        <w:t xml:space="preserve">Tight </w:t>
-      </w:r>
-      <w:proofErr w:type="gramStart"/>
-      <w:r>
-        <w:t>interlocking rules —</w:t>
-      </w:r>
-      <w:proofErr w:type="gramEnd"/>
-      <w:r>
-        <w:t xml:space="preserve"> rules involve patterns over time (consecutive days, weekends, rest after a shift), so a change on one day forces changes on </w:t>
-      </w:r>
-      <w:proofErr w:type="spellStart"/>
-      <w:r>
-        <w:t>neighbouring</w:t>
-      </w:r>
-      <w:proofErr w:type="spellEnd"/>
-      <w:r>
-        <w:t xml:space="preserve"> days.</w:t>
+        <w:t>Tight interlocking rules — rules involve patterns over time (consecutive days, weekends, rest after a shift), so a change on one day forces changes on neighbouring days.</w:t>
       </w:r>
     </w:p>
     <w:p>
@@ -4747,15 +4668,7 @@
         <w:pStyle w:val="ListBullet"/>
       </w:pPr>
       <w:r>
-        <w:t xml:space="preserve">Rostering is solved once for the whole horizon (an offline, static </w:t>
-      </w:r>
-      <w:proofErr w:type="gramStart"/>
-      <w:r>
-        <w:t>problem) —</w:t>
-      </w:r>
-      <w:proofErr w:type="gramEnd"/>
-      <w:r>
-        <w:t xml:space="preserve"> no re-planning for sick leave and no learning from data.</w:t>
+        <w:t>Rostering is solved once for the whole horizon (an offline, static problem) — no re-planning for sick leave and no learning from data.</w:t>
       </w:r>
     </w:p>
     <w:p>
@@ -4794,15 +4707,7 @@
     </w:p>
     <w:p>
       <w:r>
-        <w:t xml:space="preserve">The study has one practical objective, O1: model the problem correctly and solve it exactly on the smaller instances, reproducing the published best-known optimal values. And one comparative objective, O2: compare the exact method with a </w:t>
-      </w:r>
-      <w:proofErr w:type="gramStart"/>
-      <w:r>
-        <w:t>metaheuristic</w:t>
-      </w:r>
-      <w:proofErr w:type="gramEnd"/>
-      <w:r>
-        <w:t>, guided by four research questions.</w:t>
+        <w:t>The study has one practical objective, O1: model the problem correctly and solve it exactly on the smaller instances, reproducing the published best-known optimal values. And one comparative objective, O2: compare the exact method with a metaheuristic, guided by four research questions.</w:t>
       </w:r>
     </w:p>
     <w:p>
@@ -4818,15 +4723,7 @@
         <w:pStyle w:val="ListBullet"/>
       </w:pPr>
       <w:r>
-        <w:t xml:space="preserve">RQ2. How close does </w:t>
-      </w:r>
-      <w:proofErr w:type="gramStart"/>
-      <w:r>
-        <w:t>the GA</w:t>
-      </w:r>
-      <w:proofErr w:type="gramEnd"/>
-      <w:r>
-        <w:t xml:space="preserve"> come to the optimum, and how variable is it over repeated random runs?</w:t>
+        <w:t>RQ2. How close does the GA come to the optimum, and how variable is it over repeated random runs?</w:t>
       </w:r>
     </w:p>
     <w:p>
@@ -4916,23 +4813,7 @@
     </w:p>
     <w:p>
       <w:r>
-        <w:t xml:space="preserve">This project uses the Nurse Rostering Benchmark Instances 1–24 of </w:t>
-      </w:r>
-      <w:proofErr w:type="spellStart"/>
-      <w:r>
-        <w:t>Curtois</w:t>
-      </w:r>
-      <w:proofErr w:type="spellEnd"/>
-      <w:r>
-        <w:t xml:space="preserve"> and Qu (2014), published at schedulingbenchmarks.org/</w:t>
-      </w:r>
-      <w:proofErr w:type="spellStart"/>
-      <w:r>
-        <w:t>nrp</w:t>
-      </w:r>
-      <w:proofErr w:type="spellEnd"/>
-      <w:r>
-        <w:t>. They are staff-scheduling problems drawn from real-world and academic sources, distributed as plain-text files, free to download without registration. Each instance file contains six sections:</w:t>
+        <w:t>This project uses the Nurse Rostering Benchmark Instances 1–24 of Curtois and Qu (2014), published at schedulingbenchmarks.org/nrp. They are staff-scheduling problems drawn from real-world and academic sources, distributed as plain-text files, free to download without registration. Each instance file contains six sections:</w:t>
       </w:r>
     </w:p>
     <w:p/>
@@ -5183,15 +5064,7 @@
     </w:p>
     <w:p>
       <w:r>
-        <w:t xml:space="preserve">The benchmark also publishes a best-known solution value for every instance; for 23 of the 24 instances this value is proven </w:t>
-      </w:r>
-      <w:proofErr w:type="gramStart"/>
-      <w:r>
-        <w:t>optimal</w:t>
-      </w:r>
-      <w:proofErr w:type="gramEnd"/>
-      <w:r>
-        <w:t>. These values are the ground truth used throughout this report: a correct exact model must reproduce them. Six instances were selected to span a wide range of problem size while keeping the exact method's running time manageable:</w:t>
+        <w:t>The benchmark also publishes a best-known solution value for every instance; for 23 of the 24 instances this value is proven optimal. These values are the ground truth used throughout this report: a correct exact model must reproduce them. Six instances were selected to span a wide range of problem size while keeping the exact method's running time manageable:</w:t>
       </w:r>
     </w:p>
     <w:p/>
@@ -6043,16 +5916,8 @@
               <w:rPr>
                 <w:sz w:val="19"/>
               </w:rPr>
-              <w:t xml:space="preserve">nurses, indexed by </w:t>
-            </w:r>
-            <w:proofErr w:type="spellStart"/>
-            <w:r>
-              <w:rPr>
-                <w:sz w:val="19"/>
-              </w:rPr>
-              <w:t>i</w:t>
-            </w:r>
-            <w:proofErr w:type="spellEnd"/>
+              <w:t>nurses, indexed by i</w:t>
+            </w:r>
           </w:p>
         </w:tc>
       </w:tr>
@@ -6162,7 +6027,20 @@
               <w:rPr>
                 <w:sz w:val="19"/>
               </w:rPr>
-              <w:t>Fₜ ⊆ T</w:t>
+              <w:t>F</w:t>
+            </w:r>
+            <w:r>
+              <w:rPr>
+                <w:sz w:val="19"/>
+                <w:vertAlign w:val="subscript"/>
+              </w:rPr>
+              <w:t>t</w:t>
+            </w:r>
+            <w:r>
+              <w:rPr>
+                <w:sz w:val="19"/>
+              </w:rPr>
+              <w:t xml:space="preserve"> ⊆ T</w:t>
             </w:r>
           </w:p>
         </w:tc>
@@ -6193,7 +6071,20 @@
               <w:rPr>
                 <w:sz w:val="19"/>
               </w:rPr>
-              <w:t>Oᵢ ⊆ D</w:t>
+              <w:t>O</w:t>
+            </w:r>
+            <w:r>
+              <w:rPr>
+                <w:sz w:val="19"/>
+                <w:vertAlign w:val="subscript"/>
+              </w:rPr>
+              <w:t>i</w:t>
+            </w:r>
+            <w:r>
+              <w:rPr>
+                <w:sz w:val="19"/>
+              </w:rPr>
+              <w:t xml:space="preserve"> ⊆ D</w:t>
             </w:r>
           </w:p>
         </w:tc>
@@ -6206,30 +6097,8 @@
               <w:rPr>
                 <w:sz w:val="19"/>
               </w:rPr>
-              <w:t xml:space="preserve">fixed days </w:t>
-            </w:r>
-            <w:proofErr w:type="gramStart"/>
-            <w:r>
-              <w:rPr>
-                <w:sz w:val="19"/>
-              </w:rPr>
-              <w:t>off of</w:t>
-            </w:r>
-            <w:proofErr w:type="gramEnd"/>
-            <w:r>
-              <w:rPr>
-                <w:sz w:val="19"/>
-              </w:rPr>
-              <w:t xml:space="preserve"> nurse </w:t>
-            </w:r>
-            <w:proofErr w:type="spellStart"/>
-            <w:r>
-              <w:rPr>
-                <w:sz w:val="19"/>
-              </w:rPr>
-              <w:t>i</w:t>
-            </w:r>
-            <w:proofErr w:type="spellEnd"/>
+              <w:t>fixed days off of nurse i</w:t>
+            </w:r>
           </w:p>
         </w:tc>
       </w:tr>
@@ -6246,7 +6115,33 @@
               <w:rPr>
                 <w:sz w:val="19"/>
               </w:rPr>
-              <w:t>Rᵒⁿ, Rᵒᶠᶠ ⊆ N×D×T</w:t>
+              <w:t>R</w:t>
+            </w:r>
+            <w:r>
+              <w:rPr>
+                <w:sz w:val="19"/>
+                <w:vertAlign w:val="superscript"/>
+              </w:rPr>
+              <w:t>on</w:t>
+            </w:r>
+            <w:r>
+              <w:rPr>
+                <w:sz w:val="19"/>
+              </w:rPr>
+              <w:t>, R</w:t>
+            </w:r>
+            <w:r>
+              <w:rPr>
+                <w:sz w:val="19"/>
+                <w:vertAlign w:val="superscript"/>
+              </w:rPr>
+              <w:t>off</w:t>
+            </w:r>
+            <w:r>
+              <w:rPr>
+                <w:sz w:val="19"/>
+              </w:rPr>
+              <w:t xml:space="preserve"> ⊆ N×D×T</w:t>
             </w:r>
           </w:p>
         </w:tc>
@@ -6336,7 +6231,14 @@
               <w:rPr>
                 <w:sz w:val="19"/>
               </w:rPr>
-              <w:t>ℓₜ</w:t>
+              <w:t>ℓ</w:t>
+            </w:r>
+            <w:r>
+              <w:rPr>
+                <w:sz w:val="19"/>
+                <w:vertAlign w:val="subscript"/>
+              </w:rPr>
+              <w:t>t</w:t>
             </w:r>
           </w:p>
         </w:tc>
@@ -6367,7 +6269,14 @@
               <w:rPr>
                 <w:sz w:val="19"/>
               </w:rPr>
-              <w:t>Mᵢₜ</w:t>
+              <w:t>M</w:t>
+            </w:r>
+            <w:r>
+              <w:rPr>
+                <w:sz w:val="19"/>
+                <w:vertAlign w:val="subscript"/>
+              </w:rPr>
+              <w:t>it</w:t>
             </w:r>
           </w:p>
         </w:tc>
@@ -6380,16 +6289,8 @@
               <w:rPr>
                 <w:sz w:val="19"/>
               </w:rPr>
-              <w:t xml:space="preserve">maximum number of shifts of type t for nurse </w:t>
-            </w:r>
-            <w:proofErr w:type="spellStart"/>
-            <w:r>
-              <w:rPr>
-                <w:sz w:val="19"/>
-              </w:rPr>
-              <w:t>i</w:t>
-            </w:r>
-            <w:proofErr w:type="spellEnd"/>
+              <w:t>maximum number of shifts of type t for nurse i</w:t>
+            </w:r>
           </w:p>
         </w:tc>
       </w:tr>
@@ -6406,7 +6307,41 @@
               <w:rPr>
                 <w:sz w:val="19"/>
               </w:rPr>
-              <w:t>Lᵢᵐᴵⁿ, Lᵢᵐᵃˣ</w:t>
+              <w:t>L</w:t>
+            </w:r>
+            <w:r>
+              <w:rPr>
+                <w:sz w:val="19"/>
+                <w:vertAlign w:val="subscript"/>
+              </w:rPr>
+              <w:t>i</w:t>
+            </w:r>
+            <w:r>
+              <w:rPr>
+                <w:sz w:val="19"/>
+                <w:vertAlign w:val="superscript"/>
+              </w:rPr>
+              <w:t>min</w:t>
+            </w:r>
+            <w:r>
+              <w:rPr>
+                <w:sz w:val="19"/>
+              </w:rPr>
+              <w:t>, L</w:t>
+            </w:r>
+            <w:r>
+              <w:rPr>
+                <w:sz w:val="19"/>
+                <w:vertAlign w:val="subscript"/>
+              </w:rPr>
+              <w:t>i</w:t>
+            </w:r>
+            <w:r>
+              <w:rPr>
+                <w:sz w:val="19"/>
+                <w:vertAlign w:val="superscript"/>
+              </w:rPr>
+              <w:t>max</w:t>
             </w:r>
           </w:p>
         </w:tc>
@@ -6419,16 +6354,8 @@
               <w:rPr>
                 <w:sz w:val="19"/>
               </w:rPr>
-              <w:t xml:space="preserve">minimum / maximum total working minutes of nurse </w:t>
-            </w:r>
-            <w:proofErr w:type="spellStart"/>
-            <w:r>
-              <w:rPr>
-                <w:sz w:val="19"/>
-              </w:rPr>
-              <w:t>i</w:t>
-            </w:r>
-            <w:proofErr w:type="spellEnd"/>
+              <w:t>minimum / maximum total working minutes of nurse i</w:t>
+            </w:r>
           </w:p>
         </w:tc>
       </w:tr>
@@ -6445,7 +6372,41 @@
               <w:rPr>
                 <w:sz w:val="19"/>
               </w:rPr>
-              <w:t>cᵢᵐᵃˣ, cᵢᵐᴵⁿ</w:t>
+              <w:t>c</w:t>
+            </w:r>
+            <w:r>
+              <w:rPr>
+                <w:sz w:val="19"/>
+                <w:vertAlign w:val="subscript"/>
+              </w:rPr>
+              <w:t>i</w:t>
+            </w:r>
+            <w:r>
+              <w:rPr>
+                <w:sz w:val="19"/>
+                <w:vertAlign w:val="superscript"/>
+              </w:rPr>
+              <w:t>max</w:t>
+            </w:r>
+            <w:r>
+              <w:rPr>
+                <w:sz w:val="19"/>
+              </w:rPr>
+              <w:t>, c</w:t>
+            </w:r>
+            <w:r>
+              <w:rPr>
+                <w:sz w:val="19"/>
+                <w:vertAlign w:val="subscript"/>
+              </w:rPr>
+              <w:t>i</w:t>
+            </w:r>
+            <w:r>
+              <w:rPr>
+                <w:sz w:val="19"/>
+                <w:vertAlign w:val="superscript"/>
+              </w:rPr>
+              <w:t>min</w:t>
             </w:r>
           </w:p>
         </w:tc>
@@ -6476,7 +6437,21 @@
               <w:rPr>
                 <w:sz w:val="19"/>
               </w:rPr>
-              <w:t>oᵢᵐᴵⁿ</w:t>
+              <w:t>o</w:t>
+            </w:r>
+            <w:r>
+              <w:rPr>
+                <w:sz w:val="19"/>
+                <w:vertAlign w:val="subscript"/>
+              </w:rPr>
+              <w:t>i</w:t>
+            </w:r>
+            <w:r>
+              <w:rPr>
+                <w:sz w:val="19"/>
+                <w:vertAlign w:val="superscript"/>
+              </w:rPr>
+              <w:t>min</w:t>
             </w:r>
           </w:p>
         </w:tc>
@@ -6507,7 +6482,14 @@
               <w:rPr>
                 <w:sz w:val="19"/>
               </w:rPr>
-              <w:t>Kᵢ</w:t>
+              <w:t>K</w:t>
+            </w:r>
+            <w:r>
+              <w:rPr>
+                <w:sz w:val="19"/>
+                <w:vertAlign w:val="subscript"/>
+              </w:rPr>
+              <w:t>i</w:t>
             </w:r>
           </w:p>
         </w:tc>
@@ -6520,21 +6502,7 @@
               <w:rPr>
                 <w:sz w:val="19"/>
               </w:rPr>
-              <w:t xml:space="preserve">maximum number of weekends nurse </w:t>
-            </w:r>
-            <w:proofErr w:type="spellStart"/>
-            <w:r>
-              <w:rPr>
-                <w:sz w:val="19"/>
-              </w:rPr>
-              <w:t>i</w:t>
-            </w:r>
-            <w:proofErr w:type="spellEnd"/>
-            <w:r>
-              <w:rPr>
-                <w:sz w:val="19"/>
-              </w:rPr>
-              <w:t xml:space="preserve"> may work</w:t>
+              <w:t>maximum number of weekends nurse i may work</w:t>
             </w:r>
           </w:p>
         </w:tc>
@@ -6552,23 +6520,20 @@
               <w:rPr>
                 <w:sz w:val="19"/>
               </w:rPr>
-              <w:t>rₜᵈ (</w:t>
-            </w:r>
-            <w:proofErr w:type="spellStart"/>
-            <w:proofErr w:type="gramStart"/>
-            <w:r>
-              <w:rPr>
-                <w:sz w:val="19"/>
-              </w:rPr>
-              <w:t>d,t</w:t>
-            </w:r>
-            <w:proofErr w:type="spellEnd"/>
-            <w:proofErr w:type="gramEnd"/>
-            <w:r>
-              <w:rPr>
-                <w:sz w:val="19"/>
-              </w:rPr>
-              <w:t>)</w:t>
+              <w:t>r</w:t>
+            </w:r>
+            <w:r>
+              <w:rPr>
+                <w:sz w:val="19"/>
+                <w:vertAlign w:val="subscript"/>
+              </w:rPr>
+              <w:t>dt</w:t>
+            </w:r>
+            <w:r>
+              <w:rPr>
+                <w:sz w:val="19"/>
+              </w:rPr>
+              <w:t xml:space="preserve"> (d,t)</w:t>
             </w:r>
           </w:p>
         </w:tc>
@@ -6599,23 +6564,7 @@
               <w:rPr>
                 <w:sz w:val="19"/>
               </w:rPr>
-              <w:t>p⁻, p⁺ (</w:t>
-            </w:r>
-            <w:proofErr w:type="spellStart"/>
-            <w:proofErr w:type="gramStart"/>
-            <w:r>
-              <w:rPr>
-                <w:sz w:val="19"/>
-              </w:rPr>
-              <w:t>d,t</w:t>
-            </w:r>
-            <w:proofErr w:type="spellEnd"/>
-            <w:proofErr w:type="gramEnd"/>
-            <w:r>
-              <w:rPr>
-                <w:sz w:val="19"/>
-              </w:rPr>
-              <w:t>)</w:t>
+              <w:t>p⁻, p⁺ (d,t)</w:t>
             </w:r>
           </w:p>
         </w:tc>
@@ -6646,29 +6595,7 @@
               <w:rPr>
                 <w:sz w:val="19"/>
               </w:rPr>
-              <w:t>ω (</w:t>
-            </w:r>
-            <w:proofErr w:type="spellStart"/>
-            <w:proofErr w:type="gramStart"/>
-            <w:r>
-              <w:rPr>
-                <w:sz w:val="19"/>
-              </w:rPr>
-              <w:t>i,d</w:t>
-            </w:r>
-            <w:proofErr w:type="gramEnd"/>
-            <w:r>
-              <w:rPr>
-                <w:sz w:val="19"/>
-              </w:rPr>
-              <w:t>,t</w:t>
-            </w:r>
-            <w:proofErr w:type="spellEnd"/>
-            <w:r>
-              <w:rPr>
-                <w:sz w:val="19"/>
-              </w:rPr>
-              <w:t>)</w:t>
+              <w:t>ω (i,d,t)</w:t>
             </w:r>
           </w:p>
         </w:tc>
@@ -6681,29 +6608,7 @@
               <w:rPr>
                 <w:sz w:val="19"/>
               </w:rPr>
-              <w:t>weight of the request (</w:t>
-            </w:r>
-            <w:proofErr w:type="spellStart"/>
-            <w:proofErr w:type="gramStart"/>
-            <w:r>
-              <w:rPr>
-                <w:sz w:val="19"/>
-              </w:rPr>
-              <w:t>i,d</w:t>
-            </w:r>
-            <w:proofErr w:type="gramEnd"/>
-            <w:r>
-              <w:rPr>
-                <w:sz w:val="19"/>
-              </w:rPr>
-              <w:t>,t</w:t>
-            </w:r>
-            <w:proofErr w:type="spellEnd"/>
-            <w:r>
-              <w:rPr>
-                <w:sz w:val="19"/>
-              </w:rPr>
-              <w:t>)</w:t>
+              <w:t>weight of the request (i,d,t)</w:t>
             </w:r>
           </w:p>
         </w:tc>
@@ -6780,7 +6685,20 @@
               <w:rPr>
                 <w:sz w:val="19"/>
               </w:rPr>
-              <w:t>xᵢᵈₜ ∈ {0,1}</w:t>
+              <w:t>x</w:t>
+            </w:r>
+            <w:r>
+              <w:rPr>
+                <w:sz w:val="19"/>
+                <w:vertAlign w:val="subscript"/>
+              </w:rPr>
+              <w:t>idt</w:t>
+            </w:r>
+            <w:r>
+              <w:rPr>
+                <w:sz w:val="19"/>
+              </w:rPr>
+              <w:t xml:space="preserve"> ∈ {0,1}</w:t>
             </w:r>
           </w:p>
         </w:tc>
@@ -6793,35 +6711,7 @@
               <w:rPr>
                 <w:sz w:val="19"/>
               </w:rPr>
-              <w:t xml:space="preserve">1 if nurse </w:t>
-            </w:r>
-            <w:proofErr w:type="spellStart"/>
-            <w:r>
-              <w:rPr>
-                <w:sz w:val="19"/>
-              </w:rPr>
-              <w:t>i</w:t>
-            </w:r>
-            <w:proofErr w:type="spellEnd"/>
-            <w:r>
-              <w:rPr>
-                <w:sz w:val="19"/>
-              </w:rPr>
-              <w:t xml:space="preserve"> works shift type </w:t>
-            </w:r>
-            <w:proofErr w:type="spellStart"/>
-            <w:r>
-              <w:rPr>
-                <w:sz w:val="19"/>
-              </w:rPr>
-              <w:t>t on</w:t>
-            </w:r>
-            <w:proofErr w:type="spellEnd"/>
-            <w:r>
-              <w:rPr>
-                <w:sz w:val="19"/>
-              </w:rPr>
-              <w:t xml:space="preserve"> day d</w:t>
+              <w:t>1 if nurse i works shift type t on day d</w:t>
             </w:r>
           </w:p>
         </w:tc>
@@ -6839,7 +6729,20 @@
               <w:rPr>
                 <w:sz w:val="19"/>
               </w:rPr>
-              <w:t>zᵢₑ ∈ {0,1}</w:t>
+              <w:t>z</w:t>
+            </w:r>
+            <w:r>
+              <w:rPr>
+                <w:sz w:val="19"/>
+                <w:vertAlign w:val="subscript"/>
+              </w:rPr>
+              <w:t>ie</w:t>
+            </w:r>
+            <w:r>
+              <w:rPr>
+                <w:sz w:val="19"/>
+              </w:rPr>
+              <w:t xml:space="preserve"> ∈ {0,1}</w:t>
             </w:r>
           </w:p>
         </w:tc>
@@ -6852,21 +6755,7 @@
               <w:rPr>
                 <w:sz w:val="19"/>
               </w:rPr>
-              <w:t xml:space="preserve">1 if nurse </w:t>
-            </w:r>
-            <w:proofErr w:type="spellStart"/>
-            <w:r>
-              <w:rPr>
-                <w:sz w:val="19"/>
-              </w:rPr>
-              <w:t>i</w:t>
-            </w:r>
-            <w:proofErr w:type="spellEnd"/>
-            <w:r>
-              <w:rPr>
-                <w:sz w:val="19"/>
-              </w:rPr>
-              <w:t xml:space="preserve"> is allowed to work in weekend e</w:t>
+              <w:t>1 if nurse i is allowed to work in weekend e</w:t>
             </w:r>
           </w:p>
         </w:tc>
@@ -6884,7 +6773,33 @@
               <w:rPr>
                 <w:sz w:val="19"/>
               </w:rPr>
-              <w:t>uᵈₜ, vᵈₜ ≥ 0</w:t>
+              <w:t>u</w:t>
+            </w:r>
+            <w:r>
+              <w:rPr>
+                <w:sz w:val="19"/>
+                <w:vertAlign w:val="subscript"/>
+              </w:rPr>
+              <w:t>dt</w:t>
+            </w:r>
+            <w:r>
+              <w:rPr>
+                <w:sz w:val="19"/>
+              </w:rPr>
+              <w:t>, v</w:t>
+            </w:r>
+            <w:r>
+              <w:rPr>
+                <w:sz w:val="19"/>
+                <w:vertAlign w:val="subscript"/>
+              </w:rPr>
+              <w:t>dt</w:t>
+            </w:r>
+            <w:r>
+              <w:rPr>
+                <w:sz w:val="19"/>
+              </w:rPr>
+              <w:t xml:space="preserve"> ≥ 0</w:t>
             </w:r>
           </w:p>
         </w:tc>
@@ -6915,7 +6830,40 @@
               <w:rPr>
                 <w:sz w:val="19"/>
               </w:rPr>
-              <w:t>yᵢᵈ = Σₜ xᵢᵈₜ</w:t>
+              <w:t>y</w:t>
+            </w:r>
+            <w:r>
+              <w:rPr>
+                <w:sz w:val="19"/>
+                <w:vertAlign w:val="subscript"/>
+              </w:rPr>
+              <w:t>id</w:t>
+            </w:r>
+            <w:r>
+              <w:rPr>
+                <w:sz w:val="19"/>
+              </w:rPr>
+              <w:t xml:space="preserve"> = Σ</w:t>
+            </w:r>
+            <w:r>
+              <w:rPr>
+                <w:sz w:val="19"/>
+                <w:vertAlign w:val="subscript"/>
+              </w:rPr>
+              <w:t>t</w:t>
+            </w:r>
+            <w:r>
+              <w:rPr>
+                <w:sz w:val="19"/>
+              </w:rPr>
+              <w:t xml:space="preserve"> x</w:t>
+            </w:r>
+            <w:r>
+              <w:rPr>
+                <w:sz w:val="19"/>
+                <w:vertAlign w:val="subscript"/>
+              </w:rPr>
+              <w:t>idt</w:t>
             </w:r>
           </w:p>
         </w:tc>
@@ -6928,35 +6876,7 @@
               <w:rPr>
                 <w:sz w:val="19"/>
               </w:rPr>
-              <w:t xml:space="preserve">1 if nurse </w:t>
-            </w:r>
-            <w:proofErr w:type="spellStart"/>
-            <w:r>
-              <w:rPr>
-                <w:sz w:val="19"/>
-              </w:rPr>
-              <w:t>i</w:t>
-            </w:r>
-            <w:proofErr w:type="spellEnd"/>
-            <w:r>
-              <w:rPr>
-                <w:sz w:val="19"/>
-              </w:rPr>
-              <w:t xml:space="preserve"> </w:t>
-            </w:r>
-            <w:proofErr w:type="gramStart"/>
-            <w:r>
-              <w:rPr>
-                <w:sz w:val="19"/>
-              </w:rPr>
-              <w:t>works</w:t>
-            </w:r>
-            <w:proofErr w:type="gramEnd"/>
-            <w:r>
-              <w:rPr>
-                <w:sz w:val="19"/>
-              </w:rPr>
-              <w:t xml:space="preserve"> on day d (derived, 0 or 1 by C1)</w:t>
+              <w:t>1 if nurse i works on day d (derived, 0 or 1 by C1)</w:t>
             </w:r>
           </w:p>
         </w:tc>
@@ -6985,477 +6905,68 @@
     </w:p>
     <w:p>
       <w:r>
-        <w:t xml:space="preserve">The total penalty to be </w:t>
-      </w:r>
-      <w:proofErr w:type="spellStart"/>
-      <w:r>
-        <w:t>minimised</w:t>
-      </w:r>
-      <w:proofErr w:type="spellEnd"/>
-      <w:r>
-        <w:t xml:space="preserve"> is the sum of three linear terms: cover penalties (S3), unmet shift-on requests (S1), and violated shift-off requests (S2):</w:t>
+        <w:t>The total penalty to be minimised is the sum of three linear terms: cover penalties (S3), unmet shift-on requests (S1), and violated shift-off requests (S2):</w:t>
       </w:r>
     </w:p>
     <w:p/>
     <w:p>
       <w:pPr>
-        <w:shd w:val="clear" w:color="auto" w:fill="F2F2F2"/>
-        <w:spacing w:before="160" w:after="240"/>
-        <w:jc w:val="center"/>
-      </w:pPr>
-      <w:proofErr w:type="gramStart"/>
-      <w:r>
-        <w:rPr>
-          <w:i/>
-          <w:sz w:val="21"/>
-        </w:rPr>
-        <w:t>min  f</w:t>
-      </w:r>
-      <w:proofErr w:type="gramEnd"/>
-      <w:r>
-        <w:rPr>
-          <w:i/>
-          <w:sz w:val="21"/>
-        </w:rPr>
-        <w:t xml:space="preserve"> (</w:t>
-      </w:r>
-      <w:proofErr w:type="spellStart"/>
-      <w:proofErr w:type="gramStart"/>
-      <w:r>
-        <w:rPr>
-          <w:i/>
-          <w:sz w:val="21"/>
-        </w:rPr>
-        <w:t>x,u</w:t>
-      </w:r>
-      <w:proofErr w:type="gramEnd"/>
-      <w:r>
-        <w:rPr>
-          <w:i/>
-          <w:sz w:val="21"/>
-        </w:rPr>
-        <w:t>,v</w:t>
-      </w:r>
-      <w:proofErr w:type="spellEnd"/>
-      <w:proofErr w:type="gramStart"/>
-      <w:r>
-        <w:rPr>
-          <w:i/>
-          <w:sz w:val="21"/>
-        </w:rPr>
-        <w:t>)  =</w:t>
-      </w:r>
-      <w:proofErr w:type="gramEnd"/>
-      <w:r>
-        <w:rPr>
-          <w:i/>
-          <w:sz w:val="21"/>
-        </w:rPr>
-        <w:t xml:space="preserve">  </w:t>
-      </w:r>
-      <w:proofErr w:type="spellStart"/>
-      <w:r>
-        <w:rPr>
-          <w:sz w:val="21"/>
-        </w:rPr>
-        <w:t>Σ</w:t>
-      </w:r>
-      <w:r>
-        <w:rPr>
-          <w:i/>
-          <w:sz w:val="21"/>
-        </w:rPr>
-        <w:t>d</w:t>
-      </w:r>
-      <w:r>
-        <w:rPr>
-          <w:sz w:val="21"/>
-        </w:rPr>
-        <w:t>∈</w:t>
-      </w:r>
-      <w:proofErr w:type="gramStart"/>
-      <w:r>
-        <w:rPr>
-          <w:sz w:val="21"/>
-        </w:rPr>
-        <w:t>D</w:t>
-      </w:r>
-      <w:proofErr w:type="spellEnd"/>
-      <w:r>
-        <w:rPr>
-          <w:sz w:val="21"/>
-        </w:rPr>
-        <w:t xml:space="preserve">  </w:t>
-      </w:r>
-      <w:proofErr w:type="spellStart"/>
-      <w:r>
-        <w:rPr>
-          <w:sz w:val="21"/>
-        </w:rPr>
-        <w:t>Σ</w:t>
-      </w:r>
-      <w:proofErr w:type="gramEnd"/>
-      <w:r>
-        <w:rPr>
-          <w:i/>
-          <w:sz w:val="21"/>
-        </w:rPr>
-        <w:t>t</w:t>
-      </w:r>
-      <w:r>
-        <w:rPr>
-          <w:sz w:val="21"/>
-        </w:rPr>
-        <w:t>∈</w:t>
-      </w:r>
-      <w:proofErr w:type="gramStart"/>
-      <w:r>
-        <w:rPr>
-          <w:sz w:val="21"/>
-        </w:rPr>
-        <w:t>T</w:t>
-      </w:r>
-      <w:proofErr w:type="spellEnd"/>
-      <w:r>
-        <w:rPr>
-          <w:sz w:val="21"/>
-        </w:rPr>
-        <w:t xml:space="preserve">  (</w:t>
-      </w:r>
-      <w:proofErr w:type="gramEnd"/>
-      <w:r>
-        <w:rPr>
-          <w:sz w:val="21"/>
-        </w:rPr>
-        <w:t xml:space="preserve"> </w:t>
-      </w:r>
-      <w:proofErr w:type="spellStart"/>
-      <w:r>
-        <w:rPr>
-          <w:sz w:val="21"/>
-        </w:rPr>
-        <w:t>p</w:t>
-      </w:r>
-      <w:r>
-        <w:rPr>
-          <w:i/>
-          <w:sz w:val="21"/>
-          <w:vertAlign w:val="subscript"/>
-        </w:rPr>
-        <w:t>dt</w:t>
-      </w:r>
-      <w:proofErr w:type="spellEnd"/>
-      <w:r>
-        <w:rPr>
-          <w:i/>
-          <w:sz w:val="21"/>
-          <w:vertAlign w:val="superscript"/>
-        </w:rPr>
-        <w:t>−</w:t>
-      </w:r>
-      <w:r>
-        <w:rPr>
-          <w:sz w:val="21"/>
-        </w:rPr>
-        <w:t xml:space="preserve"> </w:t>
-      </w:r>
-      <w:proofErr w:type="spellStart"/>
-      <w:proofErr w:type="gramStart"/>
-      <w:r>
-        <w:rPr>
-          <w:sz w:val="21"/>
-        </w:rPr>
-        <w:t>u</w:t>
-      </w:r>
-      <w:r>
-        <w:rPr>
-          <w:i/>
-          <w:sz w:val="21"/>
-          <w:vertAlign w:val="subscript"/>
-        </w:rPr>
-        <w:t>dt</w:t>
-      </w:r>
-      <w:proofErr w:type="spellEnd"/>
-      <w:r>
-        <w:rPr>
-          <w:sz w:val="21"/>
-        </w:rPr>
-        <w:t xml:space="preserve">  +</w:t>
-      </w:r>
-      <w:proofErr w:type="gramEnd"/>
-      <w:r>
-        <w:rPr>
-          <w:sz w:val="21"/>
-        </w:rPr>
-        <w:t xml:space="preserve">  </w:t>
-      </w:r>
-      <w:proofErr w:type="spellStart"/>
-      <w:r>
-        <w:rPr>
-          <w:sz w:val="21"/>
-        </w:rPr>
-        <w:t>p</w:t>
-      </w:r>
-      <w:r>
-        <w:rPr>
-          <w:i/>
-          <w:sz w:val="21"/>
-          <w:vertAlign w:val="subscript"/>
-        </w:rPr>
-        <w:t>dt</w:t>
-      </w:r>
-      <w:proofErr w:type="spellEnd"/>
-      <w:r>
-        <w:rPr>
-          <w:i/>
-          <w:sz w:val="21"/>
-          <w:vertAlign w:val="superscript"/>
-        </w:rPr>
-        <w:t>+</w:t>
-      </w:r>
-      <w:r>
-        <w:rPr>
-          <w:sz w:val="21"/>
-        </w:rPr>
-        <w:t xml:space="preserve"> </w:t>
-      </w:r>
-      <w:proofErr w:type="spellStart"/>
-      <w:proofErr w:type="gramStart"/>
-      <w:r>
-        <w:rPr>
-          <w:sz w:val="21"/>
-        </w:rPr>
-        <w:t>v</w:t>
-      </w:r>
-      <w:r>
-        <w:rPr>
-          <w:i/>
-          <w:sz w:val="21"/>
-          <w:vertAlign w:val="subscript"/>
-        </w:rPr>
-        <w:t>dt</w:t>
-      </w:r>
-      <w:proofErr w:type="spellEnd"/>
-      <w:r>
-        <w:rPr>
-          <w:sz w:val="21"/>
-        </w:rPr>
-        <w:t xml:space="preserve"> )</w:t>
-      </w:r>
-      <w:proofErr w:type="gramEnd"/>
-      <w:r>
-        <w:rPr>
-          <w:sz w:val="21"/>
-        </w:rPr>
-        <w:t xml:space="preserve">   +   Σ(</w:t>
-      </w:r>
-      <w:proofErr w:type="spellStart"/>
-      <w:proofErr w:type="gramStart"/>
-      <w:r>
-        <w:rPr>
-          <w:sz w:val="21"/>
-        </w:rPr>
-        <w:t>i,d</w:t>
-      </w:r>
-      <w:proofErr w:type="gramEnd"/>
-      <w:r>
-        <w:rPr>
-          <w:sz w:val="21"/>
-        </w:rPr>
-        <w:t>,</w:t>
-      </w:r>
-      <w:proofErr w:type="gramStart"/>
-      <w:r>
-        <w:rPr>
-          <w:sz w:val="21"/>
-        </w:rPr>
-        <w:t>t</w:t>
-      </w:r>
-      <w:proofErr w:type="spellEnd"/>
-      <w:r>
-        <w:rPr>
-          <w:sz w:val="21"/>
-        </w:rPr>
-        <w:t>)∈R</w:t>
-      </w:r>
-      <w:r>
-        <w:rPr>
-          <w:i/>
-          <w:sz w:val="21"/>
-          <w:vertAlign w:val="subscript"/>
-        </w:rPr>
-        <w:t>on</w:t>
-      </w:r>
-      <w:r>
-        <w:rPr>
-          <w:sz w:val="21"/>
-        </w:rPr>
-        <w:t xml:space="preserve">  </w:t>
-      </w:r>
-      <w:proofErr w:type="spellStart"/>
-      <w:r>
-        <w:rPr>
-          <w:sz w:val="21"/>
-        </w:rPr>
-        <w:t>ω</w:t>
-      </w:r>
-      <w:proofErr w:type="gramEnd"/>
-      <w:r>
-        <w:rPr>
-          <w:i/>
-          <w:sz w:val="21"/>
-          <w:vertAlign w:val="subscript"/>
-        </w:rPr>
-        <w:t>idt</w:t>
-      </w:r>
-      <w:proofErr w:type="spellEnd"/>
-      <w:r>
-        <w:rPr>
-          <w:sz w:val="21"/>
-        </w:rPr>
-        <w:t xml:space="preserve"> (1 − </w:t>
-      </w:r>
-      <w:proofErr w:type="spellStart"/>
-      <w:proofErr w:type="gramStart"/>
-      <w:r>
-        <w:rPr>
-          <w:sz w:val="21"/>
-        </w:rPr>
-        <w:t>x</w:t>
-      </w:r>
-      <w:r>
-        <w:rPr>
-          <w:i/>
-          <w:sz w:val="21"/>
-          <w:vertAlign w:val="subscript"/>
-        </w:rPr>
-        <w:t>idt</w:t>
-      </w:r>
-      <w:proofErr w:type="spellEnd"/>
-      <w:r>
-        <w:rPr>
-          <w:sz w:val="21"/>
-        </w:rPr>
-        <w:t xml:space="preserve">)   </w:t>
-      </w:r>
-      <w:proofErr w:type="gramEnd"/>
-      <w:r>
-        <w:rPr>
-          <w:sz w:val="21"/>
-        </w:rPr>
-        <w:t>+   Σ(</w:t>
-      </w:r>
-      <w:proofErr w:type="spellStart"/>
-      <w:proofErr w:type="gramStart"/>
-      <w:r>
-        <w:rPr>
-          <w:sz w:val="21"/>
-        </w:rPr>
-        <w:t>i,d</w:t>
-      </w:r>
-      <w:proofErr w:type="gramEnd"/>
-      <w:r>
-        <w:rPr>
-          <w:sz w:val="21"/>
-        </w:rPr>
-        <w:t>,</w:t>
-      </w:r>
-      <w:proofErr w:type="gramStart"/>
-      <w:r>
-        <w:rPr>
-          <w:sz w:val="21"/>
-        </w:rPr>
-        <w:t>t</w:t>
-      </w:r>
-      <w:proofErr w:type="spellEnd"/>
-      <w:r>
-        <w:rPr>
-          <w:sz w:val="21"/>
-        </w:rPr>
-        <w:t>)∈R</w:t>
-      </w:r>
-      <w:r>
-        <w:rPr>
-          <w:i/>
-          <w:sz w:val="21"/>
-          <w:vertAlign w:val="subscript"/>
-        </w:rPr>
-        <w:t>off</w:t>
-      </w:r>
-      <w:r>
-        <w:rPr>
-          <w:sz w:val="21"/>
-        </w:rPr>
-        <w:t xml:space="preserve">  </w:t>
-      </w:r>
-      <w:proofErr w:type="spellStart"/>
-      <w:r>
-        <w:rPr>
-          <w:sz w:val="21"/>
-        </w:rPr>
-        <w:t>ω</w:t>
-      </w:r>
-      <w:proofErr w:type="gramEnd"/>
-      <w:r>
-        <w:rPr>
-          <w:i/>
-          <w:sz w:val="21"/>
-          <w:vertAlign w:val="subscript"/>
-        </w:rPr>
-        <w:t>idt</w:t>
-      </w:r>
-      <w:proofErr w:type="spellEnd"/>
-      <w:r>
-        <w:rPr>
-          <w:sz w:val="21"/>
-        </w:rPr>
-        <w:t xml:space="preserve"> </w:t>
-      </w:r>
-      <w:proofErr w:type="spellStart"/>
-      <w:r>
-        <w:rPr>
-          <w:sz w:val="21"/>
-        </w:rPr>
-        <w:t>x</w:t>
-      </w:r>
-      <w:r>
-        <w:rPr>
-          <w:i/>
-          <w:sz w:val="21"/>
-          <w:vertAlign w:val="subscript"/>
-        </w:rPr>
-        <w:t>idt</w:t>
-      </w:r>
-      <w:proofErr w:type="spellEnd"/>
+        <w:tabs>
+          <w:tab w:pos="4513" w:val="center"/>
+          <w:tab w:pos="9026" w:val="right"/>
+        </w:tabs>
+        <w:spacing w:before="200" w:after="240"/>
+        <w:jc w:val="left"/>
+      </w:pPr>
+      <w:r>
+        <w:tab/>
+      </w:r>
+      <w:r>
+        <w:drawing>
+          <wp:inline xmlns:a="http://schemas.openxmlformats.org/drawingml/2006/main" xmlns:pic="http://schemas.openxmlformats.org/drawingml/2006/picture">
+            <wp:extent cx="5103876" cy="600456"/>
+            <wp:docPr id="8" name="Picture 8"/>
+            <wp:cNvGraphicFramePr>
+              <a:graphicFrameLocks noChangeAspect="1"/>
+            </wp:cNvGraphicFramePr>
+            <a:graphic>
+              <a:graphicData uri="http://schemas.openxmlformats.org/drawingml/2006/picture">
+                <pic:pic>
+                  <pic:nvPicPr>
+                    <pic:cNvPr id="0" name="eq32-1.png"/>
+                    <pic:cNvPicPr/>
+                  </pic:nvPicPr>
+                  <pic:blipFill>
+                    <a:blip r:embed="rId22"/>
+                    <a:stretch>
+                      <a:fillRect/>
+                    </a:stretch>
+                  </pic:blipFill>
+                  <pic:spPr>
+                    <a:xfrm>
+                      <a:off x="0" y="0"/>
+                      <a:ext cx="5103876" cy="600456"/>
+                    </a:xfrm>
+                    <a:prstGeom prst="rect"/>
+                  </pic:spPr>
+                </pic:pic>
+              </a:graphicData>
+            </a:graphic>
+          </wp:inline>
+        </w:drawing>
+      </w:r>
+      <w:r>
+        <w:rPr>
+          <w:sz w:val="22"/>
+        </w:rPr>
+        <w:tab/>
+        <w:t>(1)</w:t>
+      </w:r>
     </w:p>
     <w:p/>
     <w:p>
       <w:r>
-        <w:t>All three terms are linear in the variables, so the overall objective is linear. The on-request term equals a constant minus a linear term (</w:t>
-      </w:r>
-      <w:proofErr w:type="spellStart"/>
-      <w:r>
-        <w:t>Σω</w:t>
-      </w:r>
-      <w:proofErr w:type="spellEnd"/>
-      <w:r>
-        <w:t xml:space="preserve">(1−x) = c₀ − </w:t>
-      </w:r>
-      <w:proofErr w:type="spellStart"/>
-      <w:r>
-        <w:t>Σωx</w:t>
-      </w:r>
-      <w:proofErr w:type="spellEnd"/>
-      <w:r>
-        <w:t xml:space="preserve"> with c₀ = </w:t>
-      </w:r>
-      <w:proofErr w:type="spellStart"/>
-      <w:r>
-        <w:t>Σω</w:t>
-      </w:r>
-      <w:proofErr w:type="spellEnd"/>
-      <w:r>
-        <w:t>), so a solver that drops the constant c₀ reports an objective that is c₀ smaller than f; every value reported in this document includes c₀.</w:t>
+        <w:t>All three terms are linear in the variables, so the overall objective is linear. The on-request term equals a constant minus a linear term (Σω(1−x) = c₀ − Σωx with c₀ = Σω), so a solver that drops the constant c₀ reports an objective that is c₀ smaller than f; every value reported in this document includes c₀.</w:t>
       </w:r>
     </w:p>
     <w:p/>
@@ -7509,21 +7020,33 @@
         <w:rPr>
           <w:sz w:val="21"/>
         </w:rPr>
-        <w:t xml:space="preserve">Σₜ xᵢᵈₜ ≤ 1, for every nurse </w:t>
-      </w:r>
-      <w:proofErr w:type="spellStart"/>
+        <w:t>Σ</w:t>
+      </w:r>
       <w:r>
         <w:rPr>
           <w:sz w:val="21"/>
-        </w:rPr>
-        <w:t>i</w:t>
-      </w:r>
-      <w:proofErr w:type="spellEnd"/>
+          <w:vertAlign w:val="subscript"/>
+        </w:rPr>
+        <w:t>t</w:t>
+      </w:r>
       <w:r>
         <w:rPr>
           <w:sz w:val="21"/>
         </w:rPr>
-        <w:t xml:space="preserve"> and day d.</w:t>
+        <w:t xml:space="preserve"> x</w:t>
+      </w:r>
+      <w:r>
+        <w:rPr>
+          <w:sz w:val="21"/>
+          <w:vertAlign w:val="subscript"/>
+        </w:rPr>
+        <w:t>idt</w:t>
+      </w:r>
+      <w:r>
+        <w:rPr>
+          <w:sz w:val="21"/>
+        </w:rPr>
+        <w:t xml:space="preserve"> ≤ 1, for every nurse i and day d.</w:t>
       </w:r>
     </w:p>
     <w:p>
@@ -7554,49 +7077,59 @@
         <w:rPr>
           <w:sz w:val="21"/>
         </w:rPr>
-        <w:t xml:space="preserve">If nurse </w:t>
-      </w:r>
-      <w:proofErr w:type="spellStart"/>
+        <w:t>If nurse i works t on day d, none of the shift types in F</w:t>
+      </w:r>
       <w:r>
         <w:rPr>
           <w:sz w:val="21"/>
-        </w:rPr>
-        <w:t>i</w:t>
-      </w:r>
-      <w:proofErr w:type="spellEnd"/>
+          <w:vertAlign w:val="subscript"/>
+        </w:rPr>
+        <w:t>t</w:t>
+      </w:r>
       <w:r>
         <w:rPr>
           <w:sz w:val="21"/>
         </w:rPr>
-        <w:t xml:space="preserve"> works </w:t>
-      </w:r>
-      <w:proofErr w:type="spellStart"/>
+        <w:t xml:space="preserve"> may be worked on day d+1: x</w:t>
+      </w:r>
       <w:r>
         <w:rPr>
           <w:sz w:val="21"/>
-        </w:rPr>
-        <w:t>t on</w:t>
-      </w:r>
-      <w:proofErr w:type="spellEnd"/>
+          <w:vertAlign w:val="subscript"/>
+        </w:rPr>
+        <w:t>idt</w:t>
+      </w:r>
       <w:r>
         <w:rPr>
           <w:sz w:val="21"/>
         </w:rPr>
-        <w:t xml:space="preserve"> day d, none of the shift types in Fₜ may be worked on day d+1: xᵢᵈₜ + </w:t>
-      </w:r>
-      <w:proofErr w:type="gramStart"/>
+        <w:t xml:space="preserve"> + x</w:t>
+      </w:r>
       <w:r>
         <w:rPr>
           <w:sz w:val="21"/>
-        </w:rPr>
-        <w:t>xᵢ,ᵈ</w:t>
-      </w:r>
-      <w:proofErr w:type="gramEnd"/>
+          <w:vertAlign w:val="subscript"/>
+        </w:rPr>
+        <w:t>i,d+1,s</w:t>
+      </w:r>
       <w:r>
         <w:rPr>
           <w:sz w:val="21"/>
         </w:rPr>
-        <w:t>₊₁,ₛ ≤ 1 for every s ∈ Fₜ.</w:t>
+        <w:t xml:space="preserve"> ≤ 1 for every s ∈ F</w:t>
+      </w:r>
+      <w:r>
+        <w:rPr>
+          <w:sz w:val="21"/>
+          <w:vertAlign w:val="subscript"/>
+        </w:rPr>
+        <w:t>t</w:t>
+      </w:r>
+      <w:r>
+        <w:rPr>
+          <w:sz w:val="21"/>
+        </w:rPr>
+        <w:t>.</w:t>
       </w:r>
     </w:p>
     <w:p>
@@ -7627,21 +7160,46 @@
         <w:rPr>
           <w:sz w:val="21"/>
         </w:rPr>
-        <w:t xml:space="preserve">Σᵈ xᵢᵈₜ ≤ Mᵢₜ, for every nurse </w:t>
-      </w:r>
-      <w:proofErr w:type="spellStart"/>
+        <w:t>Σ</w:t>
+      </w:r>
       <w:r>
         <w:rPr>
           <w:sz w:val="21"/>
-        </w:rPr>
-        <w:t>i</w:t>
-      </w:r>
-      <w:proofErr w:type="spellEnd"/>
+          <w:vertAlign w:val="subscript"/>
+        </w:rPr>
+        <w:t>d</w:t>
+      </w:r>
       <w:r>
         <w:rPr>
           <w:sz w:val="21"/>
         </w:rPr>
-        <w:t xml:space="preserve"> and shift type t.</w:t>
+        <w:t xml:space="preserve"> x</w:t>
+      </w:r>
+      <w:r>
+        <w:rPr>
+          <w:sz w:val="21"/>
+          <w:vertAlign w:val="subscript"/>
+        </w:rPr>
+        <w:t>idt</w:t>
+      </w:r>
+      <w:r>
+        <w:rPr>
+          <w:sz w:val="21"/>
+        </w:rPr>
+        <w:t xml:space="preserve"> ≤ M</w:t>
+      </w:r>
+      <w:r>
+        <w:rPr>
+          <w:sz w:val="21"/>
+          <w:vertAlign w:val="subscript"/>
+        </w:rPr>
+        <w:t>it</w:t>
+      </w:r>
+      <w:r>
+        <w:rPr>
+          <w:sz w:val="21"/>
+        </w:rPr>
+        <w:t>, for every nurse i and shift type t.</w:t>
       </w:r>
     </w:p>
     <w:p>
@@ -7672,21 +7230,99 @@
         <w:rPr>
           <w:sz w:val="21"/>
         </w:rPr>
-        <w:t xml:space="preserve">Lᵢᵐᴵⁿ ≤ Σᵈ Σₜ ℓₜ xᵢᵈₜ ≤ Lᵢᵐᵃˣ, for every nurse </w:t>
-      </w:r>
-      <w:proofErr w:type="spellStart"/>
+        <w:t>L</w:t>
+      </w:r>
       <w:r>
         <w:rPr>
           <w:sz w:val="21"/>
+          <w:vertAlign w:val="subscript"/>
         </w:rPr>
         <w:t>i</w:t>
       </w:r>
-      <w:proofErr w:type="spellEnd"/>
       <w:r>
         <w:rPr>
           <w:sz w:val="21"/>
-        </w:rPr>
-        <w:t>.</w:t>
+          <w:vertAlign w:val="superscript"/>
+        </w:rPr>
+        <w:t>min</w:t>
+      </w:r>
+      <w:r>
+        <w:rPr>
+          <w:sz w:val="21"/>
+        </w:rPr>
+        <w:t xml:space="preserve"> ≤ Σ</w:t>
+      </w:r>
+      <w:r>
+        <w:rPr>
+          <w:sz w:val="21"/>
+          <w:vertAlign w:val="subscript"/>
+        </w:rPr>
+        <w:t>d</w:t>
+      </w:r>
+      <w:r>
+        <w:rPr>
+          <w:sz w:val="21"/>
+        </w:rPr>
+        <w:t xml:space="preserve"> Σ</w:t>
+      </w:r>
+      <w:r>
+        <w:rPr>
+          <w:sz w:val="21"/>
+          <w:vertAlign w:val="subscript"/>
+        </w:rPr>
+        <w:t>t</w:t>
+      </w:r>
+      <w:r>
+        <w:rPr>
+          <w:sz w:val="21"/>
+        </w:rPr>
+        <w:t xml:space="preserve"> ℓ</w:t>
+      </w:r>
+      <w:r>
+        <w:rPr>
+          <w:sz w:val="21"/>
+          <w:vertAlign w:val="subscript"/>
+        </w:rPr>
+        <w:t>t</w:t>
+      </w:r>
+      <w:r>
+        <w:rPr>
+          <w:sz w:val="21"/>
+        </w:rPr>
+        <w:t xml:space="preserve"> x</w:t>
+      </w:r>
+      <w:r>
+        <w:rPr>
+          <w:sz w:val="21"/>
+          <w:vertAlign w:val="subscript"/>
+        </w:rPr>
+        <w:t>idt</w:t>
+      </w:r>
+      <w:r>
+        <w:rPr>
+          <w:sz w:val="21"/>
+        </w:rPr>
+        <w:t xml:space="preserve"> ≤ L</w:t>
+      </w:r>
+      <w:r>
+        <w:rPr>
+          <w:sz w:val="21"/>
+          <w:vertAlign w:val="subscript"/>
+        </w:rPr>
+        <w:t>i</w:t>
+      </w:r>
+      <w:r>
+        <w:rPr>
+          <w:sz w:val="21"/>
+          <w:vertAlign w:val="superscript"/>
+        </w:rPr>
+        <w:t>max</w:t>
+      </w:r>
+      <w:r>
+        <w:rPr>
+          <w:sz w:val="21"/>
+        </w:rPr>
+        <w:t>, for every nurse i.</w:t>
       </w:r>
     </w:p>
     <w:p>
@@ -7717,7 +7353,60 @@
         <w:rPr>
           <w:sz w:val="21"/>
         </w:rPr>
-        <w:t>Any cᵢᵐᵃˣ+1 consecutive days must contain at least one day off: Σ (over that window) yᵢⱼ ≤ cᵢᵐᵃˣ.</w:t>
+        <w:t>Any c</w:t>
+      </w:r>
+      <w:r>
+        <w:rPr>
+          <w:sz w:val="21"/>
+          <w:vertAlign w:val="subscript"/>
+        </w:rPr>
+        <w:t>i</w:t>
+      </w:r>
+      <w:r>
+        <w:rPr>
+          <w:sz w:val="21"/>
+          <w:vertAlign w:val="superscript"/>
+        </w:rPr>
+        <w:t>max</w:t>
+      </w:r>
+      <w:r>
+        <w:rPr>
+          <w:sz w:val="21"/>
+        </w:rPr>
+        <w:t>+1 consecutive days must contain at least one day off: Σ (over that window) y</w:t>
+      </w:r>
+      <w:r>
+        <w:rPr>
+          <w:sz w:val="21"/>
+          <w:vertAlign w:val="subscript"/>
+        </w:rPr>
+        <w:t>ij</w:t>
+      </w:r>
+      <w:r>
+        <w:rPr>
+          <w:sz w:val="21"/>
+        </w:rPr>
+        <w:t xml:space="preserve"> ≤ c</w:t>
+      </w:r>
+      <w:r>
+        <w:rPr>
+          <w:sz w:val="21"/>
+          <w:vertAlign w:val="subscript"/>
+        </w:rPr>
+        <w:t>i</w:t>
+      </w:r>
+      <w:r>
+        <w:rPr>
+          <w:sz w:val="21"/>
+          <w:vertAlign w:val="superscript"/>
+        </w:rPr>
+        <w:t>max</w:t>
+      </w:r>
+      <w:r>
+        <w:rPr>
+          <w:sz w:val="21"/>
+        </w:rPr>
+        <w:t>.</w:t>
       </w:r>
     </w:p>
     <w:p>
@@ -7745,7 +7434,27 @@
         <w:rPr>
           <w:sz w:val="21"/>
         </w:rPr>
-        <w:t>The pattern “off, s days on, off” with 1 ≤ s &lt; cᵢᵐᴵⁿ is forbidden by a linear big-M-free inequality for every valid window; a working block shorter than the minimum cannot occur.</w:t>
+        <w:t>The pattern “off, s days on, off” with 1 ≤ s &lt; c</w:t>
+      </w:r>
+      <w:r>
+        <w:rPr>
+          <w:sz w:val="21"/>
+          <w:vertAlign w:val="subscript"/>
+        </w:rPr>
+        <w:t>i</w:t>
+      </w:r>
+      <w:r>
+        <w:rPr>
+          <w:sz w:val="21"/>
+          <w:vertAlign w:val="superscript"/>
+        </w:rPr>
+        <w:t>min</w:t>
+      </w:r>
+      <w:r>
+        <w:rPr>
+          <w:sz w:val="21"/>
+        </w:rPr>
+        <w:t xml:space="preserve"> is forbidden by a linear big-M-free inequality for every valid window; a working block shorter than the minimum cannot occur.</w:t>
       </w:r>
     </w:p>
     <w:p>
@@ -7766,6 +7475,7 @@
           <w:b/>
           <w:color w:val="1F3864"/>
         </w:rPr>
+        <w:lastRenderedPageBreak/>
         <w:t>C7 — minimum consecutive days off (H7)</w:t>
       </w:r>
     </w:p>
@@ -7780,7 +7490,27 @@
         <w:rPr>
           <w:sz w:val="21"/>
         </w:rPr>
-        <w:t>Symmetrically, the pattern “on, s days off, on” with 1 ≤ s &lt; oᵢᵐᴵⁿ is forbidden by the mirror-image inequality of C6.</w:t>
+        <w:t>Symmetrically, the pattern “on, s days off, on” with 1 ≤ s &lt; o</w:t>
+      </w:r>
+      <w:r>
+        <w:rPr>
+          <w:sz w:val="21"/>
+          <w:vertAlign w:val="subscript"/>
+        </w:rPr>
+        <w:t>i</w:t>
+      </w:r>
+      <w:r>
+        <w:rPr>
+          <w:sz w:val="21"/>
+          <w:vertAlign w:val="superscript"/>
+        </w:rPr>
+        <w:t>min</w:t>
+      </w:r>
+      <w:r>
+        <w:rPr>
+          <w:sz w:val="21"/>
+        </w:rPr>
+        <w:t xml:space="preserve"> is forbidden by the mirror-image inequality of C6.</w:t>
       </w:r>
     </w:p>
     <w:p>
@@ -7811,49 +7541,98 @@
         <w:rPr>
           <w:sz w:val="21"/>
         </w:rPr>
-        <w:t xml:space="preserve">An indicator zᵢₑ must be 1 whenever nurse </w:t>
-      </w:r>
-      <w:proofErr w:type="spellStart"/>
+        <w:t>An indicator z</w:t>
+      </w:r>
       <w:r>
         <w:rPr>
           <w:sz w:val="21"/>
+          <w:vertAlign w:val="subscript"/>
+        </w:rPr>
+        <w:t>ie</w:t>
+      </w:r>
+      <w:r>
+        <w:rPr>
+          <w:sz w:val="21"/>
+        </w:rPr>
+        <w:t xml:space="preserve"> must be 1 whenever nurse i works Saturday or Sunday of week e (y</w:t>
+      </w:r>
+      <w:r>
+        <w:rPr>
+          <w:sz w:val="21"/>
+          <w:vertAlign w:val="subscript"/>
+        </w:rPr>
+        <w:t>i,7e+5</w:t>
+      </w:r>
+      <w:r>
+        <w:rPr>
+          <w:sz w:val="21"/>
+        </w:rPr>
+        <w:t xml:space="preserve"> + y</w:t>
+      </w:r>
+      <w:r>
+        <w:rPr>
+          <w:sz w:val="21"/>
+          <w:vertAlign w:val="subscript"/>
+        </w:rPr>
+        <w:t>i,7e+6</w:t>
+      </w:r>
+      <w:r>
+        <w:rPr>
+          <w:sz w:val="21"/>
+        </w:rPr>
+        <w:t xml:space="preserve"> ≤ 2z</w:t>
+      </w:r>
+      <w:r>
+        <w:rPr>
+          <w:sz w:val="21"/>
+          <w:vertAlign w:val="subscript"/>
+        </w:rPr>
+        <w:t>ie</w:t>
+      </w:r>
+      <w:r>
+        <w:rPr>
+          <w:sz w:val="21"/>
+        </w:rPr>
+        <w:t>), and the number of such weekends is capped: Σ</w:t>
+      </w:r>
+      <w:r>
+        <w:rPr>
+          <w:sz w:val="21"/>
+          <w:vertAlign w:val="subscript"/>
+        </w:rPr>
+        <w:t>e</w:t>
+      </w:r>
+      <w:r>
+        <w:rPr>
+          <w:sz w:val="21"/>
+        </w:rPr>
+        <w:t xml:space="preserve"> z</w:t>
+      </w:r>
+      <w:r>
+        <w:rPr>
+          <w:sz w:val="21"/>
+          <w:vertAlign w:val="subscript"/>
+        </w:rPr>
+        <w:t>ie</w:t>
+      </w:r>
+      <w:r>
+        <w:rPr>
+          <w:sz w:val="21"/>
+        </w:rPr>
+        <w:t xml:space="preserve"> ≤ K</w:t>
+      </w:r>
+      <w:r>
+        <w:rPr>
+          <w:sz w:val="21"/>
+          <w:vertAlign w:val="subscript"/>
         </w:rPr>
         <w:t>i</w:t>
       </w:r>
-      <w:proofErr w:type="spellEnd"/>
       <w:r>
         <w:rPr>
           <w:sz w:val="21"/>
         </w:rPr>
-        <w:t xml:space="preserve"> works Saturday or Sunday of week e (</w:t>
-      </w:r>
-      <w:proofErr w:type="gramStart"/>
-      <w:r>
-        <w:rPr>
-          <w:sz w:val="21"/>
-        </w:rPr>
-        <w:t>yᵢ,₇</w:t>
-      </w:r>
-      <w:proofErr w:type="gramEnd"/>
-      <w:r>
-        <w:rPr>
-          <w:sz w:val="21"/>
-        </w:rPr>
-        <w:t xml:space="preserve">ₑ₊₅ + </w:t>
-      </w:r>
-      <w:proofErr w:type="gramStart"/>
-      <w:r>
-        <w:rPr>
-          <w:sz w:val="21"/>
-        </w:rPr>
-        <w:t>yᵢ,₇</w:t>
-      </w:r>
-      <w:proofErr w:type="gramEnd"/>
-      <w:r>
-        <w:rPr>
-          <w:sz w:val="21"/>
-        </w:rPr>
-        <w:t>ₑ₊₆ ≤ 2zᵢₑ), and the number of such weekends is capped: Σₑ zᵢₑ ≤ Kᵢ.</w:t>
+        <w:t>.</w:t>
       </w:r>
     </w:p>
     <w:p>
@@ -7884,21 +7663,33 @@
         <w:rPr>
           <w:sz w:val="21"/>
         </w:rPr>
-        <w:t xml:space="preserve">xᵢᵈₜ = 0 for every nurse </w:t>
-      </w:r>
-      <w:proofErr w:type="spellStart"/>
+        <w:t>x</w:t>
+      </w:r>
       <w:r>
         <w:rPr>
           <w:sz w:val="21"/>
+          <w:vertAlign w:val="subscript"/>
+        </w:rPr>
+        <w:t>idt</w:t>
+      </w:r>
+      <w:r>
+        <w:rPr>
+          <w:sz w:val="21"/>
+        </w:rPr>
+        <w:t xml:space="preserve"> = 0 for every nurse i, every d ∈ O</w:t>
+      </w:r>
+      <w:r>
+        <w:rPr>
+          <w:sz w:val="21"/>
+          <w:vertAlign w:val="subscript"/>
         </w:rPr>
         <w:t>i</w:t>
       </w:r>
-      <w:proofErr w:type="spellEnd"/>
       <w:r>
         <w:rPr>
           <w:sz w:val="21"/>
         </w:rPr>
-        <w:t>, every d ∈ Oᵢ, every shift type t.</w:t>
+        <w:t>, every shift type t.</w:t>
       </w:r>
     </w:p>
     <w:p>
@@ -7929,65 +7720,72 @@
         <w:rPr>
           <w:sz w:val="21"/>
         </w:rPr>
-        <w:t xml:space="preserve">Σᵢ xᵢᵈₜ + uᵈₜ − vᵈₜ = rᵈₜ, for </w:t>
-      </w:r>
-      <w:proofErr w:type="gramStart"/>
+        <w:t>Σ</w:t>
+      </w:r>
       <w:r>
         <w:rPr>
           <w:sz w:val="21"/>
-        </w:rPr>
-        <w:t>every day</w:t>
-      </w:r>
-      <w:proofErr w:type="gramEnd"/>
+          <w:vertAlign w:val="subscript"/>
+        </w:rPr>
+        <w:t>i</w:t>
+      </w:r>
       <w:r>
         <w:rPr>
           <w:sz w:val="21"/>
         </w:rPr>
-        <w:t xml:space="preserve"> d and shift type t. Since </w:t>
-      </w:r>
-      <w:proofErr w:type="spellStart"/>
-      <w:proofErr w:type="gramStart"/>
+        <w:t xml:space="preserve"> x</w:t>
+      </w:r>
       <w:r>
         <w:rPr>
           <w:sz w:val="21"/>
-        </w:rPr>
-        <w:t>u,v</w:t>
-      </w:r>
-      <w:proofErr w:type="spellEnd"/>
-      <w:proofErr w:type="gramEnd"/>
+          <w:vertAlign w:val="subscript"/>
+        </w:rPr>
+        <w:t>idt</w:t>
+      </w:r>
       <w:r>
         <w:rPr>
           <w:sz w:val="21"/>
         </w:rPr>
-        <w:t xml:space="preserve"> ≥ 0 both carry positive penalties in a </w:t>
-      </w:r>
-      <w:proofErr w:type="spellStart"/>
+        <w:t xml:space="preserve"> + u</w:t>
+      </w:r>
       <w:r>
         <w:rPr>
           <w:sz w:val="21"/>
-        </w:rPr>
-        <w:t>minimisation</w:t>
-      </w:r>
-      <w:proofErr w:type="spellEnd"/>
+          <w:vertAlign w:val="subscript"/>
+        </w:rPr>
+        <w:t>dt</w:t>
+      </w:r>
       <w:r>
         <w:rPr>
           <w:sz w:val="21"/>
         </w:rPr>
-        <w:t xml:space="preserve">, at most one is positive at an optimum, so u and v correctly </w:t>
-      </w:r>
-      <w:proofErr w:type="spellStart"/>
+        <w:t xml:space="preserve"> − v</w:t>
+      </w:r>
       <w:r>
         <w:rPr>
           <w:sz w:val="21"/>
-        </w:rPr>
-        <w:t>linearise</w:t>
-      </w:r>
-      <w:proofErr w:type="spellEnd"/>
+          <w:vertAlign w:val="subscript"/>
+        </w:rPr>
+        <w:t>dt</w:t>
+      </w:r>
       <w:r>
         <w:rPr>
           <w:sz w:val="21"/>
         </w:rPr>
-        <w:t xml:space="preserve"> the absolute shortfall/surplus.</w:t>
+        <w:t xml:space="preserve"> = r</w:t>
+      </w:r>
+      <w:r>
+        <w:rPr>
+          <w:sz w:val="21"/>
+          <w:vertAlign w:val="subscript"/>
+        </w:rPr>
+        <w:t>dt</w:t>
+      </w:r>
+      <w:r>
+        <w:rPr>
+          <w:sz w:val="21"/>
+        </w:rPr>
+        <w:t>, for every day d and shift type t. Since u,v ≥ 0 both carry positive penalties in a minimisation, at most one is positive at an optimum, so u and v correctly linearise the absolute shortfall/surplus.</w:t>
       </w:r>
     </w:p>
     <w:p>
@@ -7997,15 +7795,43 @@
     </w:p>
     <w:p>
       <w:r>
-        <w:t xml:space="preserve">Domains: xᵢᵈₜ, zᵢₑ ∈ {0,1} and uᵈₜ, vᵈₜ ≥ 0. This is a mixed-integer linear program whose only continuous variables are the slacks u, v (which take integer values </w:t>
-      </w:r>
-      <w:proofErr w:type="gramStart"/>
-      <w:r>
-        <w:t>anyway) —</w:t>
-      </w:r>
-      <w:proofErr w:type="gramEnd"/>
-      <w:r>
-        <w:t xml:space="preserve"> effectively a pure binary ILP.</w:t>
+        <w:t>Domains: x</w:t>
+      </w:r>
+      <w:r>
+        <w:rPr>
+          <w:vertAlign w:val="subscript"/>
+        </w:rPr>
+        <w:t>idt</w:t>
+      </w:r>
+      <w:r>
+        <w:t>, z</w:t>
+      </w:r>
+      <w:r>
+        <w:rPr>
+          <w:vertAlign w:val="subscript"/>
+        </w:rPr>
+        <w:t>ie</w:t>
+      </w:r>
+      <w:r>
+        <w:t xml:space="preserve"> ∈ {0,1} and u</w:t>
+      </w:r>
+      <w:r>
+        <w:rPr>
+          <w:vertAlign w:val="subscript"/>
+        </w:rPr>
+        <w:t>dt</w:t>
+      </w:r>
+      <w:r>
+        <w:t>, v</w:t>
+      </w:r>
+      <w:r>
+        <w:rPr>
+          <w:vertAlign w:val="subscript"/>
+        </w:rPr>
+        <w:t>dt</w:t>
+      </w:r>
+      <w:r>
+        <w:t xml:space="preserve"> ≥ 0. This is a mixed-integer linear program whose only continuous variables are the slacks u, v (which take integer values anyway) — effectively a pure binary ILP.</w:t>
       </w:r>
     </w:p>
     <w:p/>
@@ -8038,39 +7864,7 @@
     </w:p>
     <w:p>
       <w:r>
-        <w:t xml:space="preserve">The model has |N||D||T| binary shift variables and |N||W| binary weekend variables. For </w:t>
-      </w:r>
-      <w:proofErr w:type="gramStart"/>
-      <w:r>
-        <w:t>Instance</w:t>
-      </w:r>
-      <w:proofErr w:type="gramEnd"/>
-      <w:r>
-        <w:t xml:space="preserve"> 1 this is 112 shift variables and 16 weekend variables; for </w:t>
-      </w:r>
-      <w:proofErr w:type="gramStart"/>
-      <w:r>
-        <w:t>Instance</w:t>
-      </w:r>
-      <w:proofErr w:type="gramEnd"/>
-      <w:r>
-        <w:t xml:space="preserve"> 12 it is 16,800 and </w:t>
-      </w:r>
-      <w:proofErr w:type="gramStart"/>
-      <w:r>
-        <w:t>60×4</w:t>
-      </w:r>
-      <w:proofErr w:type="gramEnd"/>
-      <w:r>
-        <w:t xml:space="preserve">=240. Nurse rostering with rules of this kind is known to be NP-hard in general, so no polynomial-time algorithm is </w:t>
-      </w:r>
-      <w:proofErr w:type="gramStart"/>
-      <w:r>
-        <w:t>known</w:t>
-      </w:r>
-      <w:proofErr w:type="gramEnd"/>
-      <w:r>
-        <w:t xml:space="preserve"> and the running time of any exact method may grow exponentially with instance size — exactly what Section 4 and Section 7 observe in practice.</w:t>
+        <w:t>The model has |N||D||T| binary shift variables and |N||W| binary weekend variables. For Instance 1 this is 112 shift variables and 16 weekend variables; for Instance 12 it is 16,800 and 60×4=240. Nurse rostering with rules of this kind is known to be NP-hard in general, so no polynomial-time algorithm is known and the running time of any exact method may grow exponentially with instance size — exactly what Section 4 and Section 7 observe in practice.</w:t>
       </w:r>
     </w:p>
     <w:p/>
@@ -8129,39 +7923,15 @@
           <w:b/>
           <w:color w:val="8B1A1A"/>
         </w:rPr>
+        <w:lastRenderedPageBreak/>
         <w:t xml:space="preserve">Note (verified from code/output): </w:t>
       </w:r>
-      <w:proofErr w:type="gramStart"/>
       <w:r>
         <w:rPr>
           <w:i/>
           <w:color w:val="8B1A1A"/>
         </w:rPr>
-        <w:t>Both of these</w:t>
-      </w:r>
-      <w:proofErr w:type="gramEnd"/>
-      <w:r>
-        <w:rPr>
-          <w:i/>
-          <w:color w:val="8B1A1A"/>
-        </w:rPr>
-        <w:t xml:space="preserve"> exact values (7,137 and 6,933) were reproduced by the independent GA-side evaluator in 02_</w:t>
-      </w:r>
-      <w:proofErr w:type="gramStart"/>
-      <w:r>
-        <w:rPr>
-          <w:i/>
-          <w:color w:val="8B1A1A"/>
-        </w:rPr>
-        <w:t>ga.ipynb</w:t>
-      </w:r>
-      <w:proofErr w:type="gramEnd"/>
-      <w:r>
-        <w:rPr>
-          <w:i/>
-          <w:color w:val="8B1A1A"/>
-        </w:rPr>
-        <w:t xml:space="preserve"> (“Evaluator validated: both reference values reproduced exactly”), confirming the two team members' independently written scoring code agree before either method is trusted.</w:t>
+        <w:t>Both of these exact values (7,137 and 6,933) were reproduced by the independent GA-side evaluator in 02_ga.ipynb (“Evaluator validated: both reference values reproduced exactly”), confirming the two team members' independently written scoring code agree before either method is trusted.</w:t>
       </w:r>
     </w:p>
     <w:p/>
@@ -8257,144 +8027,87 @@
         <w:spacing w:after="120"/>
       </w:pPr>
       <w:r>
-        <w:rPr>
-          <w:rFonts w:ascii="Times New Roman" w:hAnsi="Times New Roman" w:cs="Times New Roman" w:eastAsia="Times New Roman"/>
-          <w:sz w:val="22"/>
-        </w:rPr>
         <w:t>The ILP minimises exactly the objective function introduced in Section 3.2 — the same linear sum of cover penalties (S3), unmet shift-on requests (S1) and violated shift-off requests (S2) that every method in this report is scored against:</w:t>
       </w:r>
     </w:p>
     <w:p>
       <w:pPr>
-        <w:spacing w:before="160" w:after="240"/>
+        <w:spacing w:before="200" w:after="240"/>
         <w:jc w:val="center"/>
-        <w:shd w:val="clear" w:color="auto" w:fill="F2F2F2"/>
-      </w:pPr>
-      <w:r>
-        <w:rPr>
-          <w:rFonts w:ascii="Times New Roman" w:hAnsi="Times New Roman" w:cs="Times New Roman" w:eastAsia="Times New Roman"/>
-          <w:i/>
+      </w:pPr>
+      <w:r>
+        <w:drawing>
+          <wp:inline xmlns:a="http://schemas.openxmlformats.org/drawingml/2006/main" xmlns:pic="http://schemas.openxmlformats.org/drawingml/2006/picture">
+            <wp:extent cx="5103876" cy="600456"/>
+            <wp:docPr id="9" name="Picture 9"/>
+            <wp:cNvGraphicFramePr>
+              <a:graphicFrameLocks noChangeAspect="1"/>
+            </wp:cNvGraphicFramePr>
+            <a:graphic>
+              <a:graphicData uri="http://schemas.openxmlformats.org/drawingml/2006/picture">
+                <pic:pic>
+                  <pic:nvPicPr>
+                    <pic:cNvPr id="0" name="eq32-1.png"/>
+                    <pic:cNvPicPr/>
+                  </pic:nvPicPr>
+                  <pic:blipFill>
+                    <a:blip r:embed="rId22"/>
+                    <a:stretch>
+                      <a:fillRect/>
+                    </a:stretch>
+                  </pic:blipFill>
+                  <pic:spPr>
+                    <a:xfrm>
+                      <a:off x="0" y="0"/>
+                      <a:ext cx="5103876" cy="600456"/>
+                    </a:xfrm>
+                    <a:prstGeom prst="rect"/>
+                  </pic:spPr>
+                </pic:pic>
+              </a:graphicData>
+            </a:graphic>
+          </wp:inline>
+        </w:drawing>
+      </w:r>
+    </w:p>
+    <w:p>
+      <w:pPr>
+        <w:spacing w:after="200"/>
+      </w:pPr>
+      <w:r>
+        <w:rPr>
           <w:sz w:val="21"/>
         </w:rPr>
-        <w:t xml:space="preserve">min  f (x,u,v)  =  </w:t>
-      </w:r>
-      <w:r>
-        <w:rPr>
-          <w:rFonts w:ascii="Times New Roman" w:hAnsi="Times New Roman" w:cs="Times New Roman" w:eastAsia="Times New Roman"/>
-          <w:sz w:val="21"/>
-        </w:rPr>
-        <w:t>Σ</w:t>
-      </w:r>
-      <w:r>
-        <w:rPr>
-          <w:rFonts w:ascii="Times New Roman" w:hAnsi="Times New Roman" w:cs="Times New Roman" w:eastAsia="Times New Roman"/>
-          <w:i/>
-          <w:sz w:val="21"/>
-        </w:rPr>
-        <w:t>d</w:t>
-      </w:r>
-      <w:r>
-        <w:rPr>
-          <w:rFonts w:ascii="Times New Roman" w:hAnsi="Times New Roman" w:cs="Times New Roman" w:eastAsia="Times New Roman"/>
-          <w:sz w:val="21"/>
-        </w:rPr>
-        <w:t xml:space="preserve">∈D  </w:t>
-      </w:r>
-      <w:r>
-        <w:rPr>
-          <w:rFonts w:ascii="Times New Roman" w:hAnsi="Times New Roman" w:cs="Times New Roman" w:eastAsia="Times New Roman"/>
-          <w:sz w:val="21"/>
-        </w:rPr>
-        <w:t>Σ</w:t>
-      </w:r>
-      <w:r>
-        <w:rPr>
-          <w:rFonts w:ascii="Times New Roman" w:hAnsi="Times New Roman" w:cs="Times New Roman" w:eastAsia="Times New Roman"/>
-          <w:i/>
-          <w:sz w:val="21"/>
-        </w:rPr>
-        <w:t>t</w:t>
-      </w:r>
-      <w:r>
-        <w:rPr>
-          <w:rFonts w:ascii="Times New Roman" w:hAnsi="Times New Roman" w:cs="Times New Roman" w:eastAsia="Times New Roman"/>
-          <w:sz w:val="21"/>
-        </w:rPr>
-        <w:t>∈T</w:t>
-      </w:r>
-      <w:r>
-        <w:rPr>
-          <w:rFonts w:ascii="Times New Roman" w:hAnsi="Times New Roman" w:cs="Times New Roman" w:eastAsia="Times New Roman"/>
-          <w:sz w:val="21"/>
-        </w:rPr>
-        <w:t xml:space="preserve">  ( p</w:t>
-      </w:r>
-      <w:r>
-        <w:rPr>
-          <w:rFonts w:ascii="Times New Roman" w:hAnsi="Times New Roman" w:cs="Times New Roman" w:eastAsia="Times New Roman"/>
-          <w:i/>
-          <w:sz w:val="21"/>
-        </w:rPr>
-      </w:r>
-      <w:r>
-        <w:rPr>
-          <w:rFonts w:ascii="Times New Roman" w:hAnsi="Times New Roman" w:cs="Times New Roman" w:eastAsia="Times New Roman"/>
-          <w:i/>
+        <w:t>with x</w:t>
+      </w:r>
+      <w:r>
+        <w:rPr>
           <w:sz w:val="21"/>
           <w:vertAlign w:val="subscript"/>
         </w:rPr>
-        <w:t>dt</w:t>
-      </w:r>
-      <w:r>
-        <w:rPr>
-          <w:rFonts w:ascii="Times New Roman" w:hAnsi="Times New Roman" w:cs="Times New Roman" w:eastAsia="Times New Roman"/>
-          <w:i/>
+        <w:t>idt</w:t>
+      </w:r>
+      <w:r>
+        <w:rPr>
           <w:sz w:val="21"/>
-          <w:vertAlign w:val="superscript"/>
-        </w:rPr>
-        <w:t>−</w:t>
-      </w:r>
-      <w:r>
-        <w:rPr>
-          <w:rFonts w:ascii="Times New Roman" w:hAnsi="Times New Roman" w:cs="Times New Roman" w:eastAsia="Times New Roman"/>
-          <w:sz w:val="21"/>
-        </w:rPr>
-        <w:t xml:space="preserve"> u</w:t>
-      </w:r>
-      <w:r>
-        <w:rPr>
-          <w:rFonts w:ascii="Times New Roman" w:hAnsi="Times New Roman" w:cs="Times New Roman" w:eastAsia="Times New Roman"/>
-          <w:i/>
-          <w:sz w:val="21"/>
-        </w:rPr>
-      </w:r>
-      <w:r>
-        <w:rPr>
-          <w:rFonts w:ascii="Times New Roman" w:hAnsi="Times New Roman" w:cs="Times New Roman" w:eastAsia="Times New Roman"/>
-          <w:i/>
+        </w:rPr>
+        <w:t>, z</w:t>
+      </w:r>
+      <w:r>
+        <w:rPr>
           <w:sz w:val="21"/>
           <w:vertAlign w:val="subscript"/>
         </w:rPr>
-        <w:t>dt</w:t>
-      </w:r>
-      <w:r>
-        <w:rPr>
-          <w:rFonts w:ascii="Times New Roman" w:hAnsi="Times New Roman" w:cs="Times New Roman" w:eastAsia="Times New Roman"/>
+        <w:t>ie</w:t>
+      </w:r>
+      <w:r>
+        <w:rPr>
           <w:sz w:val="21"/>
         </w:rPr>
-        <w:t xml:space="preserve">  +  p</w:t>
-      </w:r>
-      <w:r>
-        <w:rPr>
-          <w:rFonts w:ascii="Times New Roman" w:hAnsi="Times New Roman" w:cs="Times New Roman" w:eastAsia="Times New Roman"/>
-          <w:i/>
-          <w:sz w:val="21"/>
-        </w:rPr>
-      </w:r>
-      <w:r>
-        <w:rPr>
-          <w:rFonts w:ascii="Times New Roman" w:hAnsi="Times New Roman" w:cs="Times New Roman" w:eastAsia="Times New Roman"/>
-          <w:i/>
+        <w:t xml:space="preserve"> ∈ {0,1} the binary decision variables and u</w:t>
+      </w:r>
+      <w:r>
+        <w:rPr>
           <w:sz w:val="21"/>
           <w:vertAlign w:val="subscript"/>
         </w:rPr>
@@ -8402,31 +8115,12 @@
       </w:r>
       <w:r>
         <w:rPr>
-          <w:rFonts w:ascii="Times New Roman" w:hAnsi="Times New Roman" w:cs="Times New Roman" w:eastAsia="Times New Roman"/>
-          <w:i/>
           <w:sz w:val="21"/>
-          <w:vertAlign w:val="superscript"/>
-        </w:rPr>
-        <w:t>+</w:t>
-      </w:r>
-      <w:r>
-        <w:rPr>
-          <w:rFonts w:ascii="Times New Roman" w:hAnsi="Times New Roman" w:cs="Times New Roman" w:eastAsia="Times New Roman"/>
-          <w:sz w:val="21"/>
-        </w:rPr>
-        <w:t xml:space="preserve"> v</w:t>
-      </w:r>
-      <w:r>
-        <w:rPr>
-          <w:rFonts w:ascii="Times New Roman" w:hAnsi="Times New Roman" w:cs="Times New Roman" w:eastAsia="Times New Roman"/>
-          <w:i/>
-          <w:sz w:val="21"/>
-        </w:rPr>
-      </w:r>
-      <w:r>
-        <w:rPr>
-          <w:rFonts w:ascii="Times New Roman" w:hAnsi="Times New Roman" w:cs="Times New Roman" w:eastAsia="Times New Roman"/>
-          <w:i/>
+        </w:rPr>
+        <w:t>, v</w:t>
+      </w:r>
+      <w:r>
+        <w:rPr>
           <w:sz w:val="21"/>
           <w:vertAlign w:val="subscript"/>
         </w:rPr>
@@ -8434,181 +8128,9 @@
       </w:r>
       <w:r>
         <w:rPr>
-          <w:rFonts w:ascii="Times New Roman" w:hAnsi="Times New Roman" w:cs="Times New Roman" w:eastAsia="Times New Roman"/>
           <w:sz w:val="21"/>
         </w:rPr>
-        <w:t xml:space="preserve"> )</w:t>
-      </w:r>
-      <w:r>
-        <w:rPr>
-          <w:rFonts w:ascii="Times New Roman" w:hAnsi="Times New Roman" w:cs="Times New Roman" w:eastAsia="Times New Roman"/>
-          <w:sz w:val="21"/>
-        </w:rPr>
-        <w:t xml:space="preserve">   +   Σ</w:t>
-      </w:r>
-      <w:r>
-        <w:rPr>
-          <w:rFonts w:ascii="Times New Roman" w:hAnsi="Times New Roman" w:cs="Times New Roman" w:eastAsia="Times New Roman"/>
-          <w:sz w:val="21"/>
-        </w:rPr>
-        <w:t>(i,d,t)∈R</w:t>
-      </w:r>
-      <w:r>
-        <w:rPr>
-          <w:rFonts w:ascii="Times New Roman" w:hAnsi="Times New Roman" w:cs="Times New Roman" w:eastAsia="Times New Roman"/>
-          <w:i/>
-          <w:sz w:val="21"/>
-        </w:rPr>
-      </w:r>
-      <w:r>
-        <w:rPr>
-          <w:rFonts w:ascii="Times New Roman" w:hAnsi="Times New Roman" w:cs="Times New Roman" w:eastAsia="Times New Roman"/>
-          <w:i/>
-          <w:sz w:val="21"/>
-          <w:vertAlign w:val="subscript"/>
-        </w:rPr>
-        <w:t>on</w:t>
-      </w:r>
-      <w:r>
-        <w:rPr>
-          <w:rFonts w:ascii="Times New Roman" w:hAnsi="Times New Roman" w:cs="Times New Roman" w:eastAsia="Times New Roman"/>
-          <w:sz w:val="21"/>
-        </w:rPr>
-        <w:t xml:space="preserve">  ω</w:t>
-      </w:r>
-      <w:r>
-        <w:rPr>
-          <w:rFonts w:ascii="Times New Roman" w:hAnsi="Times New Roman" w:cs="Times New Roman" w:eastAsia="Times New Roman"/>
-          <w:i/>
-          <w:sz w:val="21"/>
-        </w:rPr>
-      </w:r>
-      <w:r>
-        <w:rPr>
-          <w:rFonts w:ascii="Times New Roman" w:hAnsi="Times New Roman" w:cs="Times New Roman" w:eastAsia="Times New Roman"/>
-          <w:i/>
-          <w:sz w:val="21"/>
-          <w:vertAlign w:val="subscript"/>
-        </w:rPr>
-        <w:t>idt</w:t>
-      </w:r>
-      <w:r>
-        <w:rPr>
-          <w:rFonts w:ascii="Times New Roman" w:hAnsi="Times New Roman" w:cs="Times New Roman" w:eastAsia="Times New Roman"/>
-          <w:sz w:val="21"/>
-        </w:rPr>
-        <w:t xml:space="preserve"> (1 − x</w:t>
-      </w:r>
-      <w:r>
-        <w:rPr>
-          <w:rFonts w:ascii="Times New Roman" w:hAnsi="Times New Roman" w:cs="Times New Roman" w:eastAsia="Times New Roman"/>
-          <w:i/>
-          <w:sz w:val="21"/>
-        </w:rPr>
-      </w:r>
-      <w:r>
-        <w:rPr>
-          <w:rFonts w:ascii="Times New Roman" w:hAnsi="Times New Roman" w:cs="Times New Roman" w:eastAsia="Times New Roman"/>
-          <w:i/>
-          <w:sz w:val="21"/>
-          <w:vertAlign w:val="subscript"/>
-        </w:rPr>
-        <w:t>idt</w:t>
-      </w:r>
-      <w:r>
-        <w:rPr>
-          <w:rFonts w:ascii="Times New Roman" w:hAnsi="Times New Roman" w:cs="Times New Roman" w:eastAsia="Times New Roman"/>
-          <w:sz w:val="21"/>
-        </w:rPr>
-        <w:t>)</w:t>
-      </w:r>
-      <w:r>
-        <w:rPr>
-          <w:rFonts w:ascii="Times New Roman" w:hAnsi="Times New Roman" w:cs="Times New Roman" w:eastAsia="Times New Roman"/>
-          <w:sz w:val="21"/>
-        </w:rPr>
-        <w:t xml:space="preserve">   +   Σ</w:t>
-      </w:r>
-      <w:r>
-        <w:rPr>
-          <w:rFonts w:ascii="Times New Roman" w:hAnsi="Times New Roman" w:cs="Times New Roman" w:eastAsia="Times New Roman"/>
-          <w:sz w:val="21"/>
-        </w:rPr>
-        <w:t>(i,d,t)∈R</w:t>
-      </w:r>
-      <w:r>
-        <w:rPr>
-          <w:rFonts w:ascii="Times New Roman" w:hAnsi="Times New Roman" w:cs="Times New Roman" w:eastAsia="Times New Roman"/>
-          <w:i/>
-          <w:sz w:val="21"/>
-        </w:rPr>
-      </w:r>
-      <w:r>
-        <w:rPr>
-          <w:rFonts w:ascii="Times New Roman" w:hAnsi="Times New Roman" w:cs="Times New Roman" w:eastAsia="Times New Roman"/>
-          <w:i/>
-          <w:sz w:val="21"/>
-          <w:vertAlign w:val="subscript"/>
-        </w:rPr>
-        <w:t>off</w:t>
-      </w:r>
-      <w:r>
-        <w:rPr>
-          <w:rFonts w:ascii="Times New Roman" w:hAnsi="Times New Roman" w:cs="Times New Roman" w:eastAsia="Times New Roman"/>
-          <w:sz w:val="21"/>
-        </w:rPr>
-        <w:t xml:space="preserve">  ω</w:t>
-      </w:r>
-      <w:r>
-        <w:rPr>
-          <w:rFonts w:ascii="Times New Roman" w:hAnsi="Times New Roman" w:cs="Times New Roman" w:eastAsia="Times New Roman"/>
-          <w:i/>
-          <w:sz w:val="21"/>
-        </w:rPr>
-      </w:r>
-      <w:r>
-        <w:rPr>
-          <w:rFonts w:ascii="Times New Roman" w:hAnsi="Times New Roman" w:cs="Times New Roman" w:eastAsia="Times New Roman"/>
-          <w:i/>
-          <w:sz w:val="21"/>
-          <w:vertAlign w:val="subscript"/>
-        </w:rPr>
-        <w:t>idt</w:t>
-      </w:r>
-      <w:r>
-        <w:rPr>
-          <w:rFonts w:ascii="Times New Roman" w:hAnsi="Times New Roman" w:cs="Times New Roman" w:eastAsia="Times New Roman"/>
-          <w:sz w:val="21"/>
-        </w:rPr>
-        <w:t xml:space="preserve"> x</w:t>
-      </w:r>
-      <w:r>
-        <w:rPr>
-          <w:rFonts w:ascii="Times New Roman" w:hAnsi="Times New Roman" w:cs="Times New Roman" w:eastAsia="Times New Roman"/>
-          <w:i/>
-          <w:sz w:val="21"/>
-        </w:rPr>
-      </w:r>
-      <w:r>
-        <w:rPr>
-          <w:rFonts w:ascii="Times New Roman" w:hAnsi="Times New Roman" w:cs="Times New Roman" w:eastAsia="Times New Roman"/>
-          <w:i/>
-          <w:sz w:val="21"/>
-          <w:vertAlign w:val="subscript"/>
-        </w:rPr>
-        <w:t>idt</w:t>
-      </w:r>
-    </w:p>
-    <w:p>
-      <w:pPr>
-        <w:spacing w:after="200"/>
-      </w:pPr>
-      <w:r>
-        <w:rPr>
-          <w:rFonts w:ascii="Times New Roman" w:hAnsi="Times New Roman" w:cs="Times New Roman" w:eastAsia="Times New Roman"/>
-          <w:sz w:val="21"/>
-        </w:rPr>
-        <w:t>with xᵢᵈₜ, zᵢₑ ∈ {0,1} the binary decision variables and uᵈₜ, vᵈₜ ≥ 0 the under-/over-cover slacks, all defined in Section 3.1.</w:t>
+        <w:t xml:space="preserve"> ≥ 0 the under-/over-cover slacks, all defined in Section 3.1.</w:t>
       </w:r>
     </w:p>
     <w:p>
@@ -8619,39 +8141,79 @@
     </w:p>
     <w:p>
       <w:r>
-        <w:t xml:space="preserve">The exact solver combines three ideas from Lectures 3–5. The LP relaxation — replacing xᵢᵈₜ ∈ {0,1} and zᵢₑ ∈ {0,1} with 0 ≤ xᵢᵈₜ ≤ 1 and 0 ≤ zᵢₑ ≤ 1 — is an ordinary linear program solvable in polynomial time, and because its feasible set contains every integer-feasible roster, its optimum </w:t>
-      </w:r>
-      <w:proofErr w:type="spellStart"/>
-      <w:r>
-        <w:t>f_LP</w:t>
-      </w:r>
-      <w:proofErr w:type="spellEnd"/>
-      <w:r>
-        <w:t xml:space="preserve"> is a guaranteed lower bound on the true optimum f*. Branching picks a fractional variable and splits the problem into two smaller subproblems (xₖ=0 and xₖ=1 for a binary variable); bounding discards any subproblem whose own LP bound cannot beat the best integer roster found so far (the incumbent). The search maintains a tree of such subproblems until none </w:t>
-      </w:r>
-      <w:proofErr w:type="gramStart"/>
-      <w:r>
-        <w:t>remain</w:t>
-      </w:r>
-      <w:proofErr w:type="gramEnd"/>
-      <w:r>
-        <w:t xml:space="preserve"> open, at which point the incumbent is provably optimal. Modern solvers such as CBC (used here through </w:t>
-      </w:r>
-      <w:proofErr w:type="spellStart"/>
-      <w:r>
-        <w:t>PuLP</w:t>
-      </w:r>
-      <w:proofErr w:type="spellEnd"/>
-      <w:r>
-        <w:t xml:space="preserve">) also add cutting planes before branching (branch and cut) and apply </w:t>
-      </w:r>
-      <w:proofErr w:type="spellStart"/>
-      <w:r>
-        <w:t>presolve</w:t>
-      </w:r>
-      <w:proofErr w:type="spellEnd"/>
-      <w:r>
-        <w:t xml:space="preserve"> and primal heuristics to find good incumbents early.</w:t>
+        <w:t>The exact solver combines three ideas from Lectures 3–5. The LP relaxation — replacing x</w:t>
+      </w:r>
+      <w:r>
+        <w:rPr>
+          <w:vertAlign w:val="subscript"/>
+        </w:rPr>
+        <w:t>idt</w:t>
+      </w:r>
+      <w:r>
+        <w:t xml:space="preserve"> ∈ {0,1} and z</w:t>
+      </w:r>
+      <w:r>
+        <w:rPr>
+          <w:vertAlign w:val="subscript"/>
+        </w:rPr>
+        <w:t>ie</w:t>
+      </w:r>
+      <w:r>
+        <w:t xml:space="preserve"> ∈ {0,1} with 0 ≤ x</w:t>
+      </w:r>
+      <w:r>
+        <w:rPr>
+          <w:vertAlign w:val="subscript"/>
+        </w:rPr>
+        <w:t>idt</w:t>
+      </w:r>
+      <w:r>
+        <w:t xml:space="preserve"> ≤ 1 and 0 ≤ z</w:t>
+      </w:r>
+      <w:r>
+        <w:rPr>
+          <w:vertAlign w:val="subscript"/>
+        </w:rPr>
+        <w:t>ie</w:t>
+      </w:r>
+      <w:r>
+        <w:t xml:space="preserve"> ≤ 1 — is an ordinary linear program solvable in polynomial time, and because its feasible set contains every integer-feasible roster, its optimum f</w:t>
+      </w:r>
+      <w:r>
+        <w:rPr>
+          <w:vertAlign w:val="subscript"/>
+        </w:rPr>
+        <w:t>LP</w:t>
+      </w:r>
+      <w:r>
+        <w:t xml:space="preserve"> is a guaranteed lower bound on the true optimum f</w:t>
+      </w:r>
+      <w:r>
+        <w:rPr>
+          <w:vertAlign w:val="superscript"/>
+        </w:rPr>
+        <w:t>*</w:t>
+      </w:r>
+      <w:r>
+        <w:t>. Branching picks a fractional variable and splits the problem into two smaller subproblems (x</w:t>
+      </w:r>
+      <w:r>
+        <w:rPr>
+          <w:vertAlign w:val="subscript"/>
+        </w:rPr>
+        <w:t>k</w:t>
+      </w:r>
+      <w:r>
+        <w:t>=0 and x</w:t>
+      </w:r>
+      <w:r>
+        <w:rPr>
+          <w:vertAlign w:val="subscript"/>
+        </w:rPr>
+        <w:t>k</w:t>
+      </w:r>
+      <w:r>
+        <w:t>=1 for a binary variable); bounding discards any subproblem whose own LP bound cannot beat the best integer roster found so far (the incumbent). The search maintains a tree of such subproblems until none remain open, at which point the incumbent is provably optimal. Modern solvers such as CBC (used here through PuLP) also add cutting planes before branching (branch and cut) and apply presolve and primal heuristics to find good incumbents early.</w:t>
       </w:r>
     </w:p>
     <w:p/>
@@ -8684,31 +8246,7 @@
     </w:p>
     <w:p>
       <w:r>
-        <w:t>The model was built incrementally in 01_</w:t>
-      </w:r>
-      <w:proofErr w:type="gramStart"/>
-      <w:r>
-        <w:t>ilp.ipynb</w:t>
-      </w:r>
-      <w:proofErr w:type="gramEnd"/>
-      <w:r>
-        <w:t xml:space="preserve"> and validated at each stage before moving on, using </w:t>
-      </w:r>
-      <w:proofErr w:type="spellStart"/>
-      <w:r>
-        <w:t>conda</w:t>
-      </w:r>
-      <w:proofErr w:type="spellEnd"/>
-      <w:r>
-        <w:t xml:space="preserve"> environment seyon (Python 3.10.19) with </w:t>
-      </w:r>
-      <w:proofErr w:type="spellStart"/>
-      <w:r>
-        <w:t>PuLP</w:t>
-      </w:r>
-      <w:proofErr w:type="spellEnd"/>
-      <w:r>
-        <w:t xml:space="preserve"> 3.3.2 and the CBC solver.</w:t>
+        <w:t>The model was built incrementally in 01_ilp.ipynb and validated at each stage before moving on, using conda environment seyon (Python 3.10.19) with PuLP 3.3.2 and the CBC solver.</w:t>
       </w:r>
     </w:p>
     <w:p/>
@@ -8717,13 +8255,8 @@
         <w:pStyle w:val="ListBullet"/>
       </w:pPr>
       <w:r>
-        <w:t>ILP v1 (C1–C4, C9, C10 only, Day 2): on Instance 1 and 2 this deliberately incomplete model gave objectives of 3 and 208 respectively — both correctly below the full best-known values (607 and 828), confirming it is a relaxation (fewer rules than the real problem), not a bug.</w:t>
-      </w:r>
-      <w:r>
-        <w:rPr>
-          <w:rFonts w:ascii="Times New Roman" w:hAnsi="Times New Roman" w:cs="Times New Roman" w:eastAsia="Times New Roman"/>
-        </w:rPr>
-        <w:t xml:space="preserve"> Concretely, a cheaper-but-illegal roster of this kind can let one nurse work one very long, unbroken stretch, which C5–C8 (not yet modelled in this version) would otherwise forbid.</w:t>
+        <w:lastRenderedPageBreak/>
+        <w:t>ILP v1 (C1–C4, C9, C10 only, Day 2): on Instance 1 and 2 this deliberately incomplete model gave objectives of 3 and 208 respectively — both correctly below the full best-known values (607 and 828), confirming it is a relaxation (fewer rules than the real problem), not a bug. Concretely, a cheaper-but-illegal roster of this kind can let one nurse work one very long, unbroken stretch, which C5–C8 (not yet modelled in this version) would otherwise forbid.</w:t>
       </w:r>
     </w:p>
     <w:p>
@@ -8756,7 +8289,6 @@
           <w:b/>
           <w:color w:val="8B1A1A"/>
         </w:rPr>
-        <w:lastRenderedPageBreak/>
         <w:t xml:space="preserve">Note (verified from code/output): </w:t>
       </w:r>
       <w:r>
@@ -8764,87 +8296,7 @@
           <w:i/>
           <w:color w:val="8B1A1A"/>
         </w:rPr>
-        <w:t xml:space="preserve">A genuine implementation trap was caught and fixed during Day 4: </w:t>
-      </w:r>
-      <w:proofErr w:type="spellStart"/>
-      <w:r>
-        <w:rPr>
-          <w:i/>
-          <w:color w:val="8B1A1A"/>
-        </w:rPr>
-        <w:t>PuLP's</w:t>
-      </w:r>
-      <w:proofErr w:type="spellEnd"/>
-      <w:r>
-        <w:rPr>
-          <w:i/>
-          <w:color w:val="8B1A1A"/>
-        </w:rPr>
-        <w:t xml:space="preserve"> own </w:t>
-      </w:r>
-      <w:proofErr w:type="spellStart"/>
-      <w:r>
-        <w:rPr>
-          <w:i/>
-          <w:color w:val="8B1A1A"/>
-        </w:rPr>
-        <w:t>LpStatus</w:t>
-      </w:r>
-      <w:proofErr w:type="spellEnd"/>
-      <w:r>
-        <w:rPr>
-          <w:i/>
-          <w:color w:val="8B1A1A"/>
-        </w:rPr>
-        <w:t xml:space="preserve"> can report “Optimal” even on a run that was </w:t>
-      </w:r>
-      <w:proofErr w:type="gramStart"/>
-      <w:r>
-        <w:rPr>
-          <w:i/>
-          <w:color w:val="8B1A1A"/>
-        </w:rPr>
-        <w:t>actually stopped</w:t>
-      </w:r>
-      <w:proofErr w:type="gramEnd"/>
-      <w:r>
-        <w:rPr>
-          <w:i/>
-          <w:color w:val="8B1A1A"/>
-        </w:rPr>
-        <w:t xml:space="preserve"> by the time limit with no real solution found. The code now reads the solver's own </w:t>
-      </w:r>
-      <w:proofErr w:type="spellStart"/>
-      <w:r>
-        <w:rPr>
-          <w:i/>
-          <w:color w:val="8B1A1A"/>
-        </w:rPr>
-        <w:t>sol_status</w:t>
-      </w:r>
-      <w:proofErr w:type="spellEnd"/>
-      <w:r>
-        <w:rPr>
-          <w:i/>
-          <w:color w:val="8B1A1A"/>
-        </w:rPr>
-        <w:t xml:space="preserve"> field (1 = proven optimal, 2 = feasible/time-limit reached, 0 = no feasible solution) instead, and a second trap — </w:t>
-      </w:r>
-      <w:proofErr w:type="spellStart"/>
-      <w:r>
-        <w:rPr>
-          <w:i/>
-          <w:color w:val="8B1A1A"/>
-        </w:rPr>
-        <w:t>pulp.value</w:t>
-      </w:r>
-      <w:proofErr w:type="spellEnd"/>
-      <w:r>
-        <w:rPr>
-          <w:i/>
-          <w:color w:val="8B1A1A"/>
-        </w:rPr>
-        <w:t>(objective) silently returning a bogus fractional number when CBC found zero feasible solutions — is now caught and reported honestly as “no feasible solution found” rather than as a real (but wrong) score.</w:t>
+        <w:t>A genuine implementation trap was caught and fixed during Day 4: PuLP's own LpStatus can report “Optimal” even on a run that was actually stopped by the time limit with no real solution found. The code now reads the solver's own sol_status field (1 = proven optimal, 2 = feasible/time-limit reached, 0 = no feasible solution) instead, and a second trap — pulp.value(objective) silently returning a bogus fractional number when CBC found zero feasible solutions — is now caught and reported honestly as “no feasible solution found” rather than as a real (but wrong) score.</w:t>
       </w:r>
     </w:p>
     <w:p/>
@@ -9128,21 +8580,7 @@
     </w:p>
     <w:p>
       <w:r>
-        <w:t xml:space="preserve">A relatively small gap here means the LP relaxation is already </w:t>
-      </w:r>
-      <w:proofErr w:type="gramStart"/>
-      <w:r>
-        <w:t>a tight</w:t>
-      </w:r>
-      <w:proofErr w:type="gramEnd"/>
-      <w:r>
-        <w:t>, useful bound for branch and bound to prune against — part of why CBC proves Instance 1 and Instance 2 so quickly (under two seconds each) despite the astronomically large number of possible rosters.</w:t>
-      </w:r>
-      <w:r>
-        <w:rPr>
-          <w:rFonts w:ascii="Times New Roman" w:hAnsi="Times New Roman" w:cs="Times New Roman" w:eastAsia="Times New Roman"/>
-        </w:rPr>
-        <w:t xml:space="preserve"> For Instance 1 specifically, CBC reaches the proven optimum in about 1.5 seconds — jumping straight from the 405 floor to the proven 607 without ever enumerating a meaningful fraction of the roster's raw search space.</w:t>
+        <w:t>A relatively small gap here means the LP relaxation is already a tight, useful bound for branch and bound to prune against — part of why CBC proves Instance 1 and Instance 2 so quickly (under two seconds each) despite the astronomically large number of possible rosters. For Instance 1 specifically, CBC reaches the proven optimum in about 1.5 seconds — jumping straight from the 405 floor to the proven 607 without ever enumerating a meaningful fraction of the roster's raw search space.</w:t>
       </w:r>
     </w:p>
     <w:p>
@@ -9163,23 +8601,7 @@
     </w:p>
     <w:p>
       <w:r>
-        <w:t xml:space="preserve">During the search the solver tracks a lower bound (the smallest bound among open nodes) and an incumbent. The relative optimality gap is </w:t>
-      </w:r>
-      <w:proofErr w:type="spellStart"/>
-      <w:r>
-        <w:t>gap_MIP</w:t>
-      </w:r>
-      <w:proofErr w:type="spellEnd"/>
-      <w:r>
-        <w:t xml:space="preserve"> = (incumbent − lower bound) / incumbent × 100%, and the solver has proved optimality only when this reaches 0%. Because running time can grow exponentially, each run in this project was capped at 300 seconds; a run that hits this limit returns its incumbent together with a positive </w:t>
-      </w:r>
-      <w:proofErr w:type="spellStart"/>
-      <w:r>
-        <w:t>gap_MIP</w:t>
-      </w:r>
-      <w:proofErr w:type="spellEnd"/>
-      <w:r>
-        <w:t xml:space="preserve"> and must be reported as “feasible, not proven optimal” rather than as a solved instance.</w:t>
+        <w:t>During the search the solver tracks a lower bound (the smallest bound among open nodes) and an incumbent. The relative optimality gap is gap_MIP = (incumbent − lower bound) / incumbent × 100%, and the solver has proved optimality only when this reaches 0%. Because running time can grow exponentially, each run in this project was capped at 300 seconds; a run that hits this limit returns its incumbent together with a positive gap_MIP and must be reported as “feasible, not proven optimal” rather than as a solved instance.</w:t>
       </w:r>
     </w:p>
     <w:p/>
@@ -9218,39 +8640,7 @@
           <w:i/>
           <w:color w:val="8B1A1A"/>
         </w:rPr>
-        <w:t>The LP relaxation's dual variables would attach a shadow price to every cover constraint (C10), showing which day/shift combinations are the roster's real bottlenecks (Lecture 4). This was planned as an optional analysis in the original methodology document but was not actually computed in 01_</w:t>
-      </w:r>
-      <w:proofErr w:type="gramStart"/>
-      <w:r>
-        <w:rPr>
-          <w:i/>
-          <w:color w:val="8B1A1A"/>
-        </w:rPr>
-        <w:t>ilp.ipynb</w:t>
-      </w:r>
-      <w:proofErr w:type="gramEnd"/>
-      <w:r>
-        <w:rPr>
-          <w:i/>
-          <w:color w:val="8B1A1A"/>
-        </w:rPr>
-        <w:t xml:space="preserve"> — flagged here as a genuine gap rather than claimed as </w:t>
-      </w:r>
-      <w:proofErr w:type="gramStart"/>
-      <w:r>
-        <w:rPr>
-          <w:i/>
-          <w:color w:val="8B1A1A"/>
-        </w:rPr>
-        <w:t>done, and</w:t>
-      </w:r>
-      <w:proofErr w:type="gramEnd"/>
-      <w:r>
-        <w:rPr>
-          <w:i/>
-          <w:color w:val="8B1A1A"/>
-        </w:rPr>
-        <w:t xml:space="preserve"> listed again as outstanding work in Section 8.4.</w:t>
+        <w:t>The LP relaxation's dual variables would attach a shadow price to every cover constraint (C10), showing which day/shift combinations are the roster's real bottlenecks (Lecture 4). This was planned as an optional analysis in the original methodology document but was not actually computed in 01_ilp.ipynb — flagged here as a genuine gap rather than claimed as done, and listed again as outstanding work in Section 8.4.</w:t>
       </w:r>
     </w:p>
     <w:p/>
@@ -10031,8 +9421,9 @@
         <w:rPr>
           <w:noProof/>
         </w:rPr>
+        <w:lastRenderedPageBreak/>
         <w:drawing>
-          <wp:inline distT="0" distB="0" distL="0" distR="0" wp14:anchorId="721495D8" wp14:editId="1AC57496">
+          <wp:inline distT="0" distB="0" distL="0" distR="0" wp14:anchorId="4ECBF01B" wp14:editId="00C71700">
             <wp:extent cx="5120640" cy="3291840"/>
             <wp:effectExtent l="0" t="0" r="0" b="0"/>
             <wp:docPr id="1" name="Picture 1"/>
@@ -10113,7 +9504,7 @@
           <w:noProof/>
         </w:rPr>
         <w:drawing>
-          <wp:inline distT="0" distB="0" distL="0" distR="0" wp14:anchorId="24165C03" wp14:editId="08D49771">
+          <wp:inline distT="0" distB="0" distL="0" distR="0" wp14:anchorId="70CA10A5" wp14:editId="12ED8C3F">
             <wp:extent cx="5120640" cy="3291840"/>
             <wp:effectExtent l="0" t="0" r="0" b="0"/>
             <wp:docPr id="2" name="Picture 2"/>
@@ -10165,25 +9556,7 @@
           <w:color w:val="555555"/>
           <w:sz w:val="19"/>
         </w:rPr>
-        <w:t xml:space="preserve">Figure 4.2 — ILP solution quality (gap to best-known) versus problem size, for </w:t>
-      </w:r>
-      <w:proofErr w:type="gramStart"/>
-      <w:r>
-        <w:rPr>
-          <w:i/>
-          <w:color w:val="555555"/>
-          <w:sz w:val="19"/>
-        </w:rPr>
-        <w:t>the instances</w:t>
-      </w:r>
-      <w:proofErr w:type="gramEnd"/>
-      <w:r>
-        <w:rPr>
-          <w:i/>
-          <w:color w:val="555555"/>
-          <w:sz w:val="19"/>
-        </w:rPr>
-        <w:t xml:space="preserve"> where at least one feasible roster was found.</w:t>
+        <w:t>Figure 4.2 — ILP solution quality (gap to best-known) versus problem size, for the instances where at least one feasible roster was found.</w:t>
       </w:r>
     </w:p>
     <w:p>
@@ -10209,6 +9582,7 @@
           <w:color w:val="1F3864"/>
           <w:sz w:val="26"/>
         </w:rPr>
+        <w:lastRenderedPageBreak/>
         <w:t>4.7 The scalability wall</w:t>
       </w:r>
       <w:bookmarkEnd w:id="26"/>
@@ -10221,31 +9595,7 @@
     </w:p>
     <w:p>
       <w:r>
-        <w:t xml:space="preserve">The sharpest finding on the exact-method side is not a gradual slowdown but a wall: </w:t>
-      </w:r>
-      <w:proofErr w:type="gramStart"/>
-      <w:r>
-        <w:t>Instance</w:t>
-      </w:r>
-      <w:proofErr w:type="gramEnd"/>
-      <w:r>
-        <w:t xml:space="preserve"> 1 and 2 are proved in one to two seconds; </w:t>
-      </w:r>
-      <w:proofErr w:type="gramStart"/>
-      <w:r>
-        <w:t>Instance</w:t>
-      </w:r>
-      <w:proofErr w:type="gramEnd"/>
-      <w:r>
-        <w:t xml:space="preserve"> 3 and 6 use the entire 300-second budget and still only reach “feasible”; and Instance 8 and Instance 12 use the same 300-second budget without finding even one legal roster. The wall sits somewhere between Instance 6 (1,512 binaries) and Instance 8 (3,360 binaries) for this exact formulation — CBC spends its </w:t>
-      </w:r>
-      <w:proofErr w:type="gramStart"/>
-      <w:r>
-        <w:t>whole time</w:t>
-      </w:r>
-      <w:proofErr w:type="gramEnd"/>
-      <w:r>
-        <w:t xml:space="preserve"> budget on cuts and partial branching without ever completing a single feasible roster, because the min/max-consecutive-day constraints (C5–C7) add a very large number of extra rows as the instance grows. This is a genuine, reportable scalability result, not an implementation bug, and it is exactly the situation in which Section 5's heuristic is meant to still produce an answer.</w:t>
+        <w:t>The sharpest finding on the exact-method side is not a gradual slowdown but a wall: Instance 1 and 2 are proved in one to two seconds; Instance 3 and 6 use the entire 300-second budget and still only reach “feasible”; and Instance 8 and Instance 12 use the same 300-second budget without finding even one legal roster. The wall sits somewhere between Instance 6 (1,512 binaries) and Instance 8 (3,360 binaries) for this exact formulation — CBC spends its whole time budget on cuts and partial branching without ever completing a single feasible roster, because the min/max-consecutive-day constraints (C5–C7) add a very large number of extra rows as the instance grows. This is a genuine, reportable scalability result, not an implementation bug, and it is exactly the situation in which Section 5's heuristic is meant to still produce an answer.</w:t>
       </w:r>
     </w:p>
     <w:p>
@@ -10342,330 +9692,173 @@
           <w:color w:val="1F3864"/>
           <w:sz w:val="26"/>
         </w:rPr>
-        <w:t xml:space="preserve">5.2 Representation and </w:t>
-      </w:r>
-      <w:proofErr w:type="gramStart"/>
-      <w:r>
+        <w:t>5.2 Representation and evaluator</w:t>
+      </w:r>
+      <w:bookmarkEnd w:id="29"/>
+    </w:p>
+    <w:p>
+      <w:pPr>
+        <w:spacing w:before="320" w:after="120"/>
+        <w:outlineLvl w:val="1"/>
+      </w:pPr>
+    </w:p>
+    <w:p>
+      <w:r>
+        <w:t>A roster is an integer matrix of shape (n_nurses × n_days), where 0 denotes a day off and k denotes the k-th shift type — matching the ILP's x</w:t>
+      </w:r>
+      <w:r>
+        <w:rPr>
+          <w:vertAlign w:val="subscript"/>
+        </w:rPr>
+        <w:t>idt</w:t>
+      </w:r>
+      <w:r>
+        <w:t>=1 ⇔ X</w:t>
+      </w:r>
+      <w:r>
+        <w:rPr>
+          <w:vertAlign w:val="subscript"/>
+        </w:rPr>
+        <w:t>id</w:t>
+      </w:r>
+      <w:r>
+        <w:t>=t. The roster evaluator that scores every candidate is implemented independently of the ILP's constraint code (so neither method is graded by its own logic) and returns three things for any candidate roster: the soft penalty (under-/over-cover plus unmet/violated requests), the amount by which each hard constraint H1–H9 is violated, and whether the roster is fully feasible.</w:t>
+      </w:r>
+    </w:p>
+    <w:p/>
+    <w:p>
+      <w:pPr>
+        <w:spacing w:before="320" w:after="120"/>
+        <w:outlineLvl w:val="1"/>
         <w:rPr>
           <w:b/>
           <w:color w:val="1F3864"/>
           <w:sz w:val="26"/>
         </w:rPr>
-        <w:t>evaluator</w:t>
-      </w:r>
-      <w:bookmarkEnd w:id="29"/>
-      <w:proofErr w:type="gramEnd"/>
-    </w:p>
-    <w:p>
-      <w:pPr>
-        <w:spacing w:before="320" w:after="120"/>
-        <w:outlineLvl w:val="1"/>
-      </w:pPr>
-    </w:p>
-    <w:p>
-      <w:r>
-        <w:t>A roster is an integer matrix of shape (</w:t>
-      </w:r>
-      <w:proofErr w:type="spellStart"/>
-      <w:r>
-        <w:t>n_nurses</w:t>
-      </w:r>
-      <w:proofErr w:type="spellEnd"/>
-      <w:r>
-        <w:t xml:space="preserve"> × </w:t>
-      </w:r>
-      <w:proofErr w:type="spellStart"/>
-      <w:r>
-        <w:t>n_days</w:t>
-      </w:r>
-      <w:proofErr w:type="spellEnd"/>
-      <w:r>
-        <w:t>), where 0 denotes a day off and k denotes the k-</w:t>
-      </w:r>
-      <w:proofErr w:type="spellStart"/>
-      <w:r>
-        <w:t>th</w:t>
-      </w:r>
-      <w:proofErr w:type="spellEnd"/>
-      <w:r>
-        <w:t xml:space="preserve"> shift type — matching the ILP's xᵢᵈₜ=1 ⇔ Xᵢᵈ=t. The roster evaluator that scores every candidate is implemented independently of the ILP's constraint code (so neither method is graded by its own logic) and returns three things for any candidate roster: the soft penalty (under-/over-cover plus unmet/violated requests), the amount by which each hard constraint H1–H9 is violated, and whether the roster is fully feasible.</w:t>
-      </w:r>
-    </w:p>
-    <w:p/>
-    <w:p>
-      <w:pPr>
-        <w:spacing w:before="320" w:after="120"/>
-        <w:outlineLvl w:val="1"/>
+      </w:pPr>
+      <w:bookmarkStart w:id="30" w:name="_Toc242722347"/>
+      <w:r>
         <w:rPr>
           <w:b/>
           <w:color w:val="1F3864"/>
           <w:sz w:val="26"/>
         </w:rPr>
-      </w:pPr>
-      <w:bookmarkStart w:id="30" w:name="_Toc242722347"/>
-      <w:r>
+        <w:t>5.3 Fitness function (penalty method)</w:t>
+      </w:r>
+      <w:bookmarkEnd w:id="30"/>
+    </w:p>
+    <w:p>
+      <w:pPr>
+        <w:spacing w:before="320" w:after="120"/>
+        <w:outlineLvl w:val="1"/>
+      </w:pPr>
+    </w:p>
+    <w:p>
+      <w:r>
+        <w:t>Hard constraints are not forbidden outright but penalised, so the search can still move through infeasible regions on its way to a better one (Lecture 8). The value actually minimised, as implemented in 02_ga.ipynb, is:</w:t>
+      </w:r>
+    </w:p>
+    <w:p>
+      <w:pPr>
+        <w:shd w:val="clear" w:color="auto" w:fill="F2F2F2"/>
+        <w:spacing w:before="160" w:after="240"/>
+        <w:jc w:val="center"/>
+      </w:pPr>
+      <w:r>
+        <w:rPr>
+          <w:i/>
+          <w:sz w:val="23"/>
+        </w:rPr>
+        <w:t>F(X) = penalty(X) + ρ Σ</w:t>
+      </w:r>
+      <w:r>
+        <w:rPr>
+          <w:i/>
+          <w:sz w:val="23"/>
+          <w:vertAlign w:val="subscript"/>
+        </w:rPr>
+        <w:t>k</w:t>
+      </w:r>
+      <w:r>
+        <w:rPr>
+          <w:i/>
+          <w:sz w:val="23"/>
+        </w:rPr>
+        <w:t xml:space="preserve"> violation</w:t>
+      </w:r>
+      <w:r>
+        <w:rPr>
+          <w:i/>
+          <w:sz w:val="23"/>
+          <w:vertAlign w:val="subscript"/>
+        </w:rPr>
+        <w:t>k</w:t>
+      </w:r>
+      <w:r>
+        <w:rPr>
+          <w:i/>
+          <w:sz w:val="23"/>
+        </w:rPr>
+        <w:t>(X)</w:t>
+      </w:r>
+    </w:p>
+    <w:p>
+      <w:r>
+        <w:t>where penalty(X) is the soft objective of Section 3.2 evaluated on X, ρ is the penalty coefficient, and violation</w:t>
+      </w:r>
+      <w:r>
+        <w:rPr>
+          <w:vertAlign w:val="subscript"/>
+        </w:rPr>
+        <w:t>k</w:t>
+      </w:r>
+      <w:r>
+        <w:t xml:space="preserve"> is the amount by which hard constraint k is broken (zero when satisfied). When every violation is zero the roster is feasible and F equals the soft penalty alone.</w:t>
+      </w:r>
+    </w:p>
+    <w:p/>
+    <w:p>
+      <w:pPr>
+        <w:rPr>
+          <w:i/>
+          <w:color w:val="8B1A1A"/>
+        </w:rPr>
+      </w:pPr>
+      <w:r>
+        <w:rPr>
+          <w:b/>
+          <w:color w:val="8B1A1A"/>
+        </w:rPr>
+        <w:lastRenderedPageBreak/>
+        <w:t xml:space="preserve">Note (verified from code/output): </w:t>
+      </w:r>
+      <w:r>
+        <w:rPr>
+          <w:i/>
+          <w:color w:val="8B1A1A"/>
+        </w:rPr>
+        <w:t>The methodology document planned a quadratic penalty, ρΣV² (so that large violations are punished disproportionately more than small ones). The code actually implemented in 02_ga.ipynb uses a linear penalty, ρΣV, instead. This is a real discrepancy between the plan and the implementation, not necessarily wrong — a linear penalty is simpler to tune and still forces F → ∞ as violations grow — but it should be either reconciled with the planning document (by updating the document to match the code) or revisited before the final report, since it changes how harshly the search is pushed away from large violations relative to small ones. See Section 8.4.</w:t>
+      </w:r>
+    </w:p>
+    <w:p/>
+    <w:p>
+      <w:pPr>
+        <w:spacing w:before="320" w:after="120"/>
+        <w:outlineLvl w:val="1"/>
         <w:rPr>
           <w:b/>
           <w:color w:val="1F3864"/>
           <w:sz w:val="26"/>
         </w:rPr>
-        <w:t>5.3 Fitness function (penalty method)</w:t>
-      </w:r>
-      <w:bookmarkEnd w:id="30"/>
-    </w:p>
-    <w:p>
-      <w:pPr>
-        <w:spacing w:before="320" w:after="120"/>
-        <w:outlineLvl w:val="1"/>
-      </w:pPr>
-    </w:p>
-    <w:p>
-      <w:r>
-        <w:t xml:space="preserve">Hard constraints are not forbidden outright but </w:t>
-      </w:r>
-      <w:proofErr w:type="spellStart"/>
-      <w:r>
-        <w:t>penalised</w:t>
-      </w:r>
-      <w:proofErr w:type="spellEnd"/>
-      <w:r>
-        <w:t xml:space="preserve">, so the search can still move through infeasible regions on its way to a better one (Lecture 8). The value </w:t>
-      </w:r>
-      <w:proofErr w:type="gramStart"/>
-      <w:r>
-        <w:t xml:space="preserve">actually </w:t>
-      </w:r>
-      <w:proofErr w:type="spellStart"/>
-      <w:r>
-        <w:t>minimised</w:t>
-      </w:r>
-      <w:proofErr w:type="spellEnd"/>
-      <w:proofErr w:type="gramEnd"/>
-      <w:r>
-        <w:t>, as implemented in 02_</w:t>
-      </w:r>
-      <w:proofErr w:type="gramStart"/>
-      <w:r>
-        <w:t>ga.ipynb</w:t>
-      </w:r>
-      <w:proofErr w:type="gramEnd"/>
-      <w:r>
-        <w:t>, is:</w:t>
-      </w:r>
-    </w:p>
-    <w:p>
-      <w:pPr>
-        <w:shd w:val="clear" w:color="auto" w:fill="F2F2F2"/>
-        <w:spacing w:before="160" w:after="240"/>
-        <w:jc w:val="center"/>
-      </w:pPr>
-      <w:r>
-        <w:rPr>
-          <w:i/>
-          <w:sz w:val="23"/>
-        </w:rPr>
-        <w:t>F(X</w:t>
-      </w:r>
-      <w:proofErr w:type="gramStart"/>
-      <w:r>
-        <w:rPr>
-          <w:i/>
-          <w:sz w:val="23"/>
-        </w:rPr>
-        <w:t>)  =</w:t>
-      </w:r>
-      <w:proofErr w:type="gramEnd"/>
-      <w:r>
-        <w:rPr>
-          <w:i/>
-          <w:sz w:val="23"/>
-        </w:rPr>
-        <w:t xml:space="preserve">  penalty(X</w:t>
-      </w:r>
-      <w:proofErr w:type="gramStart"/>
-      <w:r>
-        <w:rPr>
-          <w:i/>
-          <w:sz w:val="23"/>
-        </w:rPr>
-        <w:t>)  +</w:t>
-      </w:r>
-      <w:proofErr w:type="gramEnd"/>
-      <w:r>
-        <w:rPr>
-          <w:i/>
-          <w:sz w:val="23"/>
-        </w:rPr>
-        <w:t xml:space="preserve">  ρ </w:t>
-      </w:r>
-      <w:proofErr w:type="spellStart"/>
-      <w:r>
-        <w:rPr>
-          <w:sz w:val="23"/>
-        </w:rPr>
-        <w:t>Σ</w:t>
-      </w:r>
-      <w:proofErr w:type="gramStart"/>
-      <w:r>
-        <w:rPr>
-          <w:i/>
-          <w:sz w:val="23"/>
-        </w:rPr>
-        <w:t>k</w:t>
-      </w:r>
-      <w:proofErr w:type="spellEnd"/>
-      <w:r>
-        <w:rPr>
-          <w:sz w:val="23"/>
-        </w:rPr>
-        <w:t xml:space="preserve">  </w:t>
-      </w:r>
-      <w:proofErr w:type="spellStart"/>
-      <w:r>
-        <w:rPr>
-          <w:sz w:val="23"/>
-        </w:rPr>
-        <w:t>violation</w:t>
-      </w:r>
-      <w:r>
-        <w:rPr>
-          <w:i/>
-          <w:sz w:val="23"/>
-          <w:vertAlign w:val="subscript"/>
-        </w:rPr>
-        <w:t>k</w:t>
-      </w:r>
-      <w:proofErr w:type="spellEnd"/>
-      <w:proofErr w:type="gramEnd"/>
-      <w:r>
-        <w:rPr>
-          <w:sz w:val="23"/>
-        </w:rPr>
-        <w:t>(X)</w:t>
-      </w:r>
-    </w:p>
-    <w:p>
-      <w:r>
-        <w:t xml:space="preserve">where penalty(X) is the soft objective of Section 3.2 evaluated on X, ρ is the penalty coefficient, and </w:t>
-      </w:r>
-      <w:proofErr w:type="spellStart"/>
-      <w:r>
-        <w:t>violation_k</w:t>
-      </w:r>
-      <w:proofErr w:type="spellEnd"/>
-      <w:r>
-        <w:t xml:space="preserve"> is the amount by which hard constraint k is broken (zero when satisfied). When every violation is zero the roster is feasible and F equals the soft penalty alone.</w:t>
-      </w:r>
-    </w:p>
-    <w:p/>
-    <w:p>
-      <w:pPr>
-        <w:rPr>
-          <w:i/>
-          <w:color w:val="8B1A1A"/>
-        </w:rPr>
-      </w:pPr>
-      <w:r>
-        <w:rPr>
-          <w:b/>
-          <w:color w:val="8B1A1A"/>
-        </w:rPr>
-        <w:lastRenderedPageBreak/>
-        <w:t xml:space="preserve">Note (verified from code/output): </w:t>
-      </w:r>
-      <w:r>
-        <w:rPr>
-          <w:i/>
-          <w:color w:val="8B1A1A"/>
-        </w:rPr>
-        <w:t xml:space="preserve">The methodology document planned a quadratic penalty, ρΣV² (so that large violations are punished disproportionately more than small ones). The code </w:t>
-      </w:r>
-      <w:proofErr w:type="gramStart"/>
-      <w:r>
-        <w:rPr>
-          <w:i/>
-          <w:color w:val="8B1A1A"/>
-        </w:rPr>
-        <w:t>actually implemented</w:t>
-      </w:r>
-      <w:proofErr w:type="gramEnd"/>
-      <w:r>
-        <w:rPr>
-          <w:i/>
-          <w:color w:val="8B1A1A"/>
-        </w:rPr>
-        <w:t xml:space="preserve"> in 02_</w:t>
-      </w:r>
-      <w:proofErr w:type="gramStart"/>
-      <w:r>
-        <w:rPr>
-          <w:i/>
-          <w:color w:val="8B1A1A"/>
-        </w:rPr>
-        <w:t>ga.ipynb</w:t>
-      </w:r>
-      <w:proofErr w:type="gramEnd"/>
-      <w:r>
-        <w:rPr>
-          <w:i/>
-          <w:color w:val="8B1A1A"/>
-        </w:rPr>
-        <w:t xml:space="preserve"> uses a linear penalty, </w:t>
-      </w:r>
-      <w:proofErr w:type="spellStart"/>
-      <w:r>
-        <w:rPr>
-          <w:i/>
-          <w:color w:val="8B1A1A"/>
-        </w:rPr>
-        <w:t>ρΣV</w:t>
-      </w:r>
-      <w:proofErr w:type="spellEnd"/>
-      <w:r>
-        <w:rPr>
-          <w:i/>
-          <w:color w:val="8B1A1A"/>
-        </w:rPr>
-        <w:t>, instead. This is a real discrepancy between the plan and the implementation, not necessarily wrong — a linear penalty is simpler to tune and still forces F → ∞ as violations grow — but it should be either reconciled with the planning document (by updating the document to match the code) or revisited before the final report, since it changes how harshly the search is pushed away from large violations relative to small ones. See Section 8.4.</w:t>
-      </w:r>
-    </w:p>
-    <w:p/>
-    <w:p>
-      <w:pPr>
-        <w:spacing w:before="320" w:after="120"/>
-        <w:outlineLvl w:val="1"/>
+      </w:pPr>
+      <w:bookmarkStart w:id="31" w:name="_Toc242722348"/>
+      <w:r>
         <w:rPr>
           <w:b/>
           <w:color w:val="1F3864"/>
           <w:sz w:val="26"/>
         </w:rPr>
-      </w:pPr>
-      <w:bookmarkStart w:id="31" w:name="_Toc242722348"/>
-      <w:r>
-        <w:rPr>
-          <w:b/>
-          <w:color w:val="1F3864"/>
-          <w:sz w:val="26"/>
-        </w:rPr>
-        <w:t xml:space="preserve">5.4 </w:t>
-      </w:r>
-      <w:proofErr w:type="spellStart"/>
-      <w:r>
-        <w:rPr>
-          <w:b/>
-          <w:color w:val="1F3864"/>
-          <w:sz w:val="26"/>
-        </w:rPr>
-        <w:t>Initialisation</w:t>
-      </w:r>
-      <w:proofErr w:type="spellEnd"/>
-      <w:r>
-        <w:rPr>
-          <w:b/>
-          <w:color w:val="1F3864"/>
-          <w:sz w:val="26"/>
-        </w:rPr>
-        <w:t xml:space="preserve"> and repair</w:t>
+        <w:t>5.4 Initialisation and repair</w:t>
       </w:r>
       <w:bookmarkEnd w:id="31"/>
     </w:p>
@@ -10677,15 +9870,7 @@
     </w:p>
     <w:p>
       <w:r>
-        <w:t xml:space="preserve">The population is seeded at the instance's demand density (the fraction of nurse-days that must be worked), which matches the staffing level far better than a fixed probability and helps nurses meet their minimum working time. Three constraints are additionally enforced by cheap repair operators applied after </w:t>
-      </w:r>
-      <w:proofErr w:type="spellStart"/>
-      <w:r>
-        <w:t>initialisation</w:t>
-      </w:r>
-      <w:proofErr w:type="spellEnd"/>
-      <w:r>
-        <w:t xml:space="preserve"> and after every mutation, rather than left to the penalty term:</w:t>
+        <w:t>The population is seeded at the instance's demand density (the fraction of nurse-days that must be worked), which matches the staffing level far better than a fixed probability and helps nurses meet their minimum working time. Three constraints are additionally enforced by cheap repair operators applied after initialisation and after every mutation, rather than left to the penalty term:</w:t>
       </w:r>
     </w:p>
     <w:p/>
@@ -10958,23 +10143,7 @@
       </w:pPr>
       <w:r>
         <w:lastRenderedPageBreak/>
-        <w:t xml:space="preserve">Mutation: one of three </w:t>
-      </w:r>
-      <w:proofErr w:type="gramStart"/>
-      <w:r>
-        <w:t>operators — (</w:t>
-      </w:r>
-      <w:proofErr w:type="gramEnd"/>
-      <w:r>
-        <w:t xml:space="preserve">M1) </w:t>
-      </w:r>
-      <w:proofErr w:type="gramStart"/>
-      <w:r>
-        <w:t>change</w:t>
-      </w:r>
-      <w:proofErr w:type="gramEnd"/>
-      <w:r>
-        <w:t xml:space="preserve"> a random cell to a random shift or a day off; (M2) swap the shifts of two days for one nurse (preserves that nurse's total minutes and shift counts); (M3) swap the assignments of two nurses on one day (preserves that day's cover).</w:t>
+        <w:t>Mutation: one of three operators — (M1) change a random cell to a random shift or a day off; (M2) swap the shifts of two days for one nurse (preserves that nurse's total minutes and shift counts); (M3) swap the assignments of two nurses on one day (preserves that day's cover).</w:t>
       </w:r>
     </w:p>
     <w:p>
@@ -11487,15 +10656,7 @@
     </w:p>
     <w:p>
       <w:r>
-        <w:t xml:space="preserve">A ρ too small (10) lets infeasible rosters win outright on Instance 1; ρ ≥ 1,000 is needed before any run is feasible, but going further to 10,000 does not improve quality and costs slightly more (best 1,215 vs </w:t>
-      </w:r>
-      <w:proofErr w:type="gramStart"/>
-      <w:r>
-        <w:t>1,213) —</w:t>
-      </w:r>
-      <w:proofErr w:type="gramEnd"/>
-      <w:r>
-        <w:t xml:space="preserve"> diminishing and even slightly negative returns past 1,000. No tested ρ value produced even one feasible run on Instance 2 in this 5-seed study, foreshadowing the larger feasibility problems reported in Section 7.</w:t>
+        <w:t>A ρ too small (10) lets infeasible rosters win outright on Instance 1; ρ ≥ 1,000 is needed before any run is feasible, but going further to 10,000 does not improve quality and costs slightly more (best 1,215 vs 1,213) — diminishing and even slightly negative returns past 1,000. No tested ρ value produced even one feasible run on Instance 2 in this 5-seed study, foreshadowing the larger feasibility problems reported in Section 7.</w:t>
       </w:r>
     </w:p>
     <w:p/>
@@ -11971,15 +11132,7 @@
     </w:p>
     <w:p>
       <w:r>
-        <w:t xml:space="preserve">Population 120 with mutation probability 0.1 gave the lowest mean penalty and was frozen for every scalability experiment thereafter (not </w:t>
-      </w:r>
-      <w:proofErr w:type="gramStart"/>
-      <w:r>
-        <w:t>retuned</w:t>
-      </w:r>
-      <w:proofErr w:type="gramEnd"/>
-      <w:r>
-        <w:t xml:space="preserve"> per instance):</w:t>
+        <w:t>Population 120 with mutation probability 0.1 gave the lowest mean penalty and was frozen for every scalability experiment thereafter (not retuned per instance):</w:t>
       </w:r>
     </w:p>
     <w:p>
@@ -11994,94 +11147,30 @@
           <w:b/>
           <w:color w:val="8B1A1A"/>
         </w:rPr>
-        <w:t>From 02_</w:t>
-      </w:r>
-      <w:proofErr w:type="gramStart"/>
-      <w:r>
-        <w:rPr>
-          <w:b/>
-          <w:color w:val="8B1A1A"/>
-        </w:rPr>
-        <w:t>ga.ipynb</w:t>
-      </w:r>
-      <w:proofErr w:type="gramEnd"/>
-      <w:r>
-        <w:rPr>
-          <w:b/>
-          <w:color w:val="8B1A1A"/>
-        </w:rPr>
-        <w:t xml:space="preserve">: </w:t>
+        <w:t xml:space="preserve">From 02_ga.ipynb: </w:t>
       </w:r>
       <w:r>
         <w:rPr>
           <w:i/>
           <w:color w:val="8B1A1A"/>
         </w:rPr>
-        <w:t xml:space="preserve">frozen GA parameters = </w:t>
-      </w:r>
-      <w:proofErr w:type="gramStart"/>
-      <w:r>
+        <w:t>frozen GA parameters = { population: 120, generations (cap): 200, crossover prob.: 0.8, mutation prob.: 0.1, ρ: 1000, elitism: 5 }  —  confirmed, as an out-of-sample sanity check, on Instance 3 (not used for tuning): penalty = 3,653, feasible = False.</w:t>
+      </w:r>
+    </w:p>
+    <w:p>
+      <w:pPr>
         <w:rPr>
           <w:i/>
           <w:color w:val="8B1A1A"/>
         </w:rPr>
-        <w:t>{ population</w:t>
-      </w:r>
-      <w:proofErr w:type="gramEnd"/>
-      <w:r>
+      </w:pPr>
+    </w:p>
+    <w:p>
+      <w:pPr>
         <w:rPr>
           <w:i/>
           <w:color w:val="8B1A1A"/>
         </w:rPr>
-        <w:t xml:space="preserve">: 120, generations (cap): 200, crossover prob.: 0.8, mutation prob.: 0.1, ρ: 1000, elitism: </w:t>
-      </w:r>
-      <w:proofErr w:type="gramStart"/>
-      <w:r>
-        <w:rPr>
-          <w:i/>
-          <w:color w:val="8B1A1A"/>
-        </w:rPr>
-        <w:t>5 }</w:t>
-      </w:r>
-      <w:proofErr w:type="gramEnd"/>
-      <w:r>
-        <w:rPr>
-          <w:i/>
-          <w:color w:val="8B1A1A"/>
-        </w:rPr>
-        <w:t xml:space="preserve">  </w:t>
-      </w:r>
-      <w:proofErr w:type="gramStart"/>
-      <w:r>
-        <w:rPr>
-          <w:i/>
-          <w:color w:val="8B1A1A"/>
-        </w:rPr>
-        <w:t>—  confirmed</w:t>
-      </w:r>
-      <w:proofErr w:type="gramEnd"/>
-      <w:r>
-        <w:rPr>
-          <w:i/>
-          <w:color w:val="8B1A1A"/>
-        </w:rPr>
-        <w:t>, as an out-of-sample sanity check, on Instance 3 (not used for tuning): penalty = 3,653, feasible = False.</w:t>
-      </w:r>
-    </w:p>
-    <w:p>
-      <w:pPr>
-        <w:rPr>
-          <w:i/>
-          <w:color w:val="8B1A1A"/>
-        </w:rPr>
-      </w:pPr>
-    </w:p>
-    <w:p>
-      <w:pPr>
-        <w:rPr>
-          <w:i/>
-          <w:color w:val="8B1A1A"/>
-        </w:rPr>
       </w:pPr>
     </w:p>
     <w:p/>
@@ -12095,7 +11184,7 @@
         </w:rPr>
         <w:lastRenderedPageBreak/>
         <w:drawing>
-          <wp:inline distT="0" distB="0" distL="0" distR="0" wp14:anchorId="5EC26DF1" wp14:editId="6400909D">
+          <wp:inline distT="0" distB="0" distL="0" distR="0" wp14:anchorId="3E2A071B" wp14:editId="6D5F75D1">
             <wp:extent cx="5120640" cy="4201668"/>
             <wp:effectExtent l="0" t="0" r="0" b="0"/>
             <wp:docPr id="3" name="Picture 3"/>
@@ -12165,7 +11254,7 @@
           <w:noProof/>
         </w:rPr>
         <w:drawing>
-          <wp:inline distT="0" distB="0" distL="0" distR="0" wp14:anchorId="04B8BD9E" wp14:editId="3E4EFD10">
+          <wp:inline distT="0" distB="0" distL="0" distR="0" wp14:anchorId="0237B90F" wp14:editId="2EC317BE">
             <wp:extent cx="5120640" cy="2880360"/>
             <wp:effectExtent l="0" t="0" r="0" b="0"/>
             <wp:docPr id="4" name="Picture 4"/>
@@ -12348,21 +11437,7 @@
               <w:rPr>
                 <w:sz w:val="19"/>
               </w:rPr>
-              <w:t xml:space="preserve">Python 3.10.19, </w:t>
-            </w:r>
-            <w:proofErr w:type="spellStart"/>
-            <w:r>
-              <w:rPr>
-                <w:sz w:val="19"/>
-              </w:rPr>
-              <w:t>conda</w:t>
-            </w:r>
-            <w:proofErr w:type="spellEnd"/>
-            <w:r>
-              <w:rPr>
-                <w:sz w:val="19"/>
-              </w:rPr>
-              <w:t xml:space="preserve"> environment “seyon”</w:t>
+              <w:t>Python 3.10.19, conda environment “seyon”</w:t>
             </w:r>
           </w:p>
         </w:tc>
@@ -12389,19 +11464,11 @@
             <w:tcW w:w="5472" w:type="dxa"/>
           </w:tcPr>
           <w:p>
-            <w:proofErr w:type="spellStart"/>
-            <w:r>
-              <w:rPr>
-                <w:sz w:val="19"/>
-              </w:rPr>
-              <w:t>PuLP</w:t>
-            </w:r>
-            <w:proofErr w:type="spellEnd"/>
-            <w:r>
-              <w:rPr>
-                <w:sz w:val="19"/>
-              </w:rPr>
-              <w:t xml:space="preserve"> 3.3.2, CBC solver (default branch-and-cut settings)</w:t>
+            <w:r>
+              <w:rPr>
+                <w:sz w:val="19"/>
+              </w:rPr>
+              <w:t>PuLP 3.3.2, CBC solver (default branch-and-cut settings)</w:t>
             </w:r>
           </w:p>
         </w:tc>
@@ -12523,31 +11590,7 @@
         <w:pStyle w:val="ListBullet"/>
       </w:pPr>
       <w:r>
-        <w:t xml:space="preserve">ILP protocol: one deterministic run per instance, CBC via </w:t>
-      </w:r>
-      <w:proofErr w:type="spellStart"/>
-      <w:r>
-        <w:t>PuLP</w:t>
-      </w:r>
-      <w:proofErr w:type="spellEnd"/>
-      <w:r>
-        <w:t xml:space="preserve">, 300-second time limit, status read from </w:t>
-      </w:r>
-      <w:proofErr w:type="spellStart"/>
-      <w:r>
-        <w:t>sol_status</w:t>
-      </w:r>
-      <w:proofErr w:type="spellEnd"/>
-      <w:r>
-        <w:t xml:space="preserve"> rather than </w:t>
-      </w:r>
-      <w:proofErr w:type="spellStart"/>
-      <w:r>
-        <w:t>LpStatus</w:t>
-      </w:r>
-      <w:proofErr w:type="spellEnd"/>
-      <w:r>
-        <w:t xml:space="preserve"> (Section 4.2).</w:t>
+        <w:t>ILP protocol: one deterministic run per instance, CBC via PuLP, 300-second time limit, status read from sol_status rather than LpStatus (Section 4.2).</w:t>
       </w:r>
     </w:p>
     <w:p>
@@ -12563,15 +11606,7 @@
         <w:pStyle w:val="ListBullet"/>
       </w:pPr>
       <w:r>
-        <w:t>Performance measures recorded for both methods: gap to best-known (</w:t>
-      </w:r>
-      <w:proofErr w:type="spellStart"/>
-      <w:r>
-        <w:t>gap_BKS</w:t>
-      </w:r>
-      <w:proofErr w:type="spellEnd"/>
-      <w:r>
-        <w:t>), proof status (proven optimal / feasible / no solution), wall-clock runtime, scalability against the number of binary variables, and feasibility rate.</w:t>
+        <w:t>Performance measures recorded for both methods: gap to best-known (gap_BKS), proof status (proven optimal / feasible / no solution), wall-clock runtime, scalability against the number of binary variables, and feasibility rate.</w:t>
       </w:r>
     </w:p>
     <w:p>
@@ -12748,140 +11783,20 @@
           <w:b/>
           <w:color w:val="8B1A1A"/>
         </w:rPr>
-        <w:t>Confirmed from code (02_</w:t>
-      </w:r>
-      <w:proofErr w:type="gramStart"/>
-      <w:r>
-        <w:rPr>
-          <w:b/>
-          <w:color w:val="8B1A1A"/>
-        </w:rPr>
-        <w:t>ga.ipynb</w:t>
-      </w:r>
-      <w:proofErr w:type="gramEnd"/>
-      <w:r>
-        <w:rPr>
-          <w:b/>
-          <w:color w:val="8B1A1A"/>
-        </w:rPr>
-        <w:t xml:space="preserve">): </w:t>
+        <w:t xml:space="preserve">Confirmed from code (02_ga.ipynb): </w:t>
       </w:r>
       <w:r>
         <w:rPr>
           <w:i/>
           <w:color w:val="8B1A1A"/>
         </w:rPr>
-        <w:t>The methodology document planned an equal-time comparison: “GA: 10 independent runs …, same 300 s budget” as the ILP. Reading the actual experiment-runner call in 02_</w:t>
-      </w:r>
-      <w:proofErr w:type="gramStart"/>
-      <w:r>
-        <w:rPr>
-          <w:i/>
-          <w:color w:val="8B1A1A"/>
-        </w:rPr>
-        <w:t>ga.ipynb</w:t>
-      </w:r>
-      <w:proofErr w:type="gramEnd"/>
-      <w:r>
-        <w:rPr>
-          <w:i/>
-          <w:color w:val="8B1A1A"/>
-        </w:rPr>
-        <w:t xml:space="preserve"> (</w:t>
-      </w:r>
-      <w:proofErr w:type="spellStart"/>
-      <w:r>
-        <w:rPr>
-          <w:i/>
-          <w:color w:val="8B1A1A"/>
-        </w:rPr>
-        <w:t>run_ga_</w:t>
-      </w:r>
-      <w:proofErr w:type="gramStart"/>
-      <w:r>
-        <w:rPr>
-          <w:i/>
-          <w:color w:val="8B1A1A"/>
-        </w:rPr>
-        <w:t>experiments</w:t>
-      </w:r>
-      <w:proofErr w:type="spellEnd"/>
-      <w:r>
-        <w:rPr>
-          <w:i/>
-          <w:color w:val="8B1A1A"/>
-        </w:rPr>
-        <w:t>(</w:t>
-      </w:r>
-      <w:proofErr w:type="gramEnd"/>
-      <w:r>
-        <w:rPr>
-          <w:i/>
-          <w:color w:val="8B1A1A"/>
-        </w:rPr>
-        <w:t xml:space="preserve">NUMS, </w:t>
-      </w:r>
-      <w:proofErr w:type="gramStart"/>
-      <w:r>
-        <w:rPr>
-          <w:i/>
-          <w:color w:val="8B1A1A"/>
-        </w:rPr>
-        <w:t>range(</w:t>
-      </w:r>
-      <w:proofErr w:type="gramEnd"/>
-      <w:r>
-        <w:rPr>
-          <w:i/>
-          <w:color w:val="8B1A1A"/>
-        </w:rPr>
-        <w:t xml:space="preserve">10), GA_PARAMS, </w:t>
-      </w:r>
-      <w:proofErr w:type="spellStart"/>
-      <w:r>
-        <w:rPr>
-          <w:i/>
-          <w:color w:val="8B1A1A"/>
-        </w:rPr>
-        <w:t>max_seconds</w:t>
-      </w:r>
-      <w:proofErr w:type="spellEnd"/>
-      <w:r>
-        <w:rPr>
-          <w:i/>
-          <w:color w:val="8B1A1A"/>
-        </w:rPr>
-        <w:t xml:space="preserve">=20, </w:t>
-      </w:r>
-      <w:proofErr w:type="spellStart"/>
-      <w:r>
-        <w:rPr>
-          <w:i/>
-          <w:color w:val="8B1A1A"/>
-        </w:rPr>
-        <w:t>out_csv</w:t>
-      </w:r>
-      <w:proofErr w:type="spellEnd"/>
-      <w:r>
-        <w:rPr>
-          <w:i/>
-          <w:color w:val="8B1A1A"/>
-        </w:rPr>
-        <w:t>=…)) shows the GA experiments that produced results/ga_results.csv were in fact run with a 20-second budget per run, not 300 seconds. This is confirmed directly from the code, not inferred: every recorded run time in ga_results.csv falls between 7.2 and 21.5 seconds, and the three largest instances (6, 8, 12) stop after only 27–152 of the 200-generation cap — consistent with a roughly 20-second wall-clock cutoff, not a 300-second one.</w:t>
+        <w:t>The methodology document planned an equal-time comparison: “GA: 10 independent runs …, same 300 s budget” as the ILP. Reading the actual experiment-runner call in 02_ga.ipynb (run_ga_experiments(NUMS, range(10), GA_PARAMS, max_seconds=20, out_csv=…)) shows the GA experiments that produced results/ga_results.csv were in fact run with a 20-second budget per run, not 300 seconds. This is confirmed directly from the code, not inferred: every recorded run time in ga_results.csv falls between 7.2 and 21.5 seconds, and the three largest instances (6, 8, 12) stop after only 27–152 of the 200-generation cap — consistent with a roughly 20-second wall-clock cutoff, not a 300-second one.</w:t>
       </w:r>
     </w:p>
     <w:p/>
     <w:p>
       <w:r>
-        <w:t xml:space="preserve">The practical consequence is that Section 7's headline runtime comparison (“ILP needs up to 300 s, GA needs only 7–21 s”) is not the equal-time comparison RQ4 and the methodology document both call for — the GA was simply never given the chance to use more time. It is entirely possible that a GA run given the full 300 seconds would reach a higher generation count and improve both its quality and its feasibility rate on Instances 3, 6, 8 and 12. This should be corrected — by re-running the GA experiments with </w:t>
-      </w:r>
-      <w:proofErr w:type="spellStart"/>
-      <w:r>
-        <w:t>max_seconds</w:t>
-      </w:r>
-      <w:proofErr w:type="spellEnd"/>
-      <w:r>
-        <w:t>=300 — before the comparison in Section 7 and 8 is treated as final. It is listed again as the first outstanding item in Section 8.4.</w:t>
+        <w:t>The practical consequence is that Section 7's headline runtime comparison (“ILP needs up to 300 s, GA needs only 7–21 s”) is not the equal-time comparison RQ4 and the methodology document both call for — the GA was simply never given the chance to use more time. It is entirely possible that a GA run given the full 300 seconds would reach a higher generation count and improve both its quality and its feasibility rate on Instances 3, 6, 8 and 12. This should be corrected — by re-running the GA experiments with max_seconds=300 — before the comparison in Section 7 and 8 is treated as final. It is listed again as the first outstanding item in Section 8.4.</w:t>
       </w:r>
     </w:p>
     <w:p>
@@ -14530,7 +13445,7 @@
           <w:noProof/>
         </w:rPr>
         <w:drawing>
-          <wp:inline distT="0" distB="0" distL="0" distR="0" wp14:anchorId="774F1E29" wp14:editId="3144F272">
+          <wp:inline distT="0" distB="0" distL="0" distR="0" wp14:anchorId="0D729CB6" wp14:editId="00F29D94">
             <wp:extent cx="5120640" cy="3724102"/>
             <wp:effectExtent l="0" t="0" r="0" b="0"/>
             <wp:docPr id="5" name="Picture 5"/>
@@ -14600,7 +13515,7 @@
           <w:noProof/>
         </w:rPr>
         <w:drawing>
-          <wp:inline distT="0" distB="0" distL="0" distR="0" wp14:anchorId="3D15DA74" wp14:editId="0A6A6238">
+          <wp:inline distT="0" distB="0" distL="0" distR="0" wp14:anchorId="7693F7BA" wp14:editId="259386EB">
             <wp:extent cx="5120640" cy="1862051"/>
             <wp:effectExtent l="0" t="0" r="0" b="0"/>
             <wp:docPr id="6" name="Picture 6"/>
@@ -14725,7 +13640,7 @@
           <w:noProof/>
         </w:rPr>
         <w:drawing>
-          <wp:inline distT="0" distB="0" distL="0" distR="0" wp14:anchorId="2E46BC29" wp14:editId="6AAD451D">
+          <wp:inline distT="0" distB="0" distL="0" distR="0" wp14:anchorId="27ABBD6A" wp14:editId="028E4F66">
             <wp:extent cx="5120640" cy="3291840"/>
             <wp:effectExtent l="0" t="0" r="0" b="0"/>
             <wp:docPr id="7" name="Picture 7"/>
@@ -14772,25 +13687,7 @@
           <w:color w:val="555555"/>
           <w:sz w:val="19"/>
         </w:rPr>
-        <w:t xml:space="preserve">Figure 7.3 — Spread of the GA's final penalty across </w:t>
-      </w:r>
-      <w:proofErr w:type="gramStart"/>
-      <w:r>
-        <w:rPr>
-          <w:i/>
-          <w:color w:val="555555"/>
-          <w:sz w:val="19"/>
-        </w:rPr>
-        <w:t>the 10</w:t>
-      </w:r>
-      <w:proofErr w:type="gramEnd"/>
-      <w:r>
-        <w:rPr>
-          <w:i/>
-          <w:color w:val="555555"/>
-          <w:sz w:val="19"/>
-        </w:rPr>
-        <w:t xml:space="preserve"> seeds, per instance.</w:t>
+        <w:t>Figure 7.3 — Spread of the GA's final penalty across the 10 seeds, per instance.</w:t>
       </w:r>
     </w:p>
     <w:p>
@@ -14855,23 +13752,7 @@
           <w:i/>
           <w:color w:val="8B1A1A"/>
         </w:rPr>
-        <w:t>Joint section — both members are expected to edit this (per the task division). The eight numbered findings below are reproduced from 03_</w:t>
-      </w:r>
-      <w:proofErr w:type="gramStart"/>
-      <w:r>
-        <w:rPr>
-          <w:i/>
-          <w:color w:val="8B1A1A"/>
-        </w:rPr>
-        <w:t>comparison.ipynb</w:t>
-      </w:r>
-      <w:proofErr w:type="gramEnd"/>
-      <w:r>
-        <w:rPr>
-          <w:i/>
-          <w:color w:val="8B1A1A"/>
-        </w:rPr>
-        <w:t>, each citing a real number from the merged table of Section 7.2; Section 8.4 adds three further issues found while assembling this report.</w:t>
+        <w:t>Joint section — both members are expected to edit this (per the task division). The eight numbered findings below are reproduced from 03_comparison.ipynb, each citing a real number from the merged table of Section 7.2; Section 8.4 adds three further issues found while assembling this report.</w:t>
       </w:r>
     </w:p>
     <w:p/>
@@ -14930,15 +13811,7 @@
         <w:pStyle w:val="ListNumber"/>
       </w:pPr>
       <w:r>
-        <w:t xml:space="preserve">On Instance 3 the ILP reaches the published best-known value (1,001) without formally proving it within the 300 s limit — a 0% gap to best-known, but still reported as “feasible,” not “optimal,” since the solver's own status says the search was stopped by the time limit. </w:t>
-      </w:r>
-      <w:proofErr w:type="gramStart"/>
-      <w:r>
-        <w:t>On Instance</w:t>
-      </w:r>
-      <w:proofErr w:type="gramEnd"/>
-      <w:r>
-        <w:t xml:space="preserve"> 6 it reaches 2,312 (an 18.6% gap to the best-known 1,950), again not proven.</w:t>
+        <w:t>On Instance 3 the ILP reaches the published best-known value (1,001) without formally proving it within the 300 s limit — a 0% gap to best-known, but still reported as “feasible,” not “optimal,” since the solver's own status says the search was stopped by the time limit. On Instance 6 it reaches 2,312 (an 18.6% gap to the best-known 1,950), again not proven.</w:t>
       </w:r>
     </w:p>
     <w:p>
@@ -14972,15 +13845,7 @@
         <w:pStyle w:val="ListNumber"/>
       </w:pPr>
       <w:r>
-        <w:t xml:space="preserve">The GA always produces something, even where the ILP produces nothing — on Instance 8 and 12 it returns a best-of-10-seeds roster (11,753 and 28,619 respectively), even though every one of those GA runs </w:t>
-      </w:r>
-      <w:proofErr w:type="gramStart"/>
-      <w:r>
-        <w:t>is itself</w:t>
-      </w:r>
-      <w:proofErr w:type="gramEnd"/>
-      <w:r>
-        <w:t xml:space="preserve"> infeasible (0% feasibility rate on both). This is exactly the trade-off the theory predicts: the heuristic never times out with a blank page, but it also offers no guarantee the result obeys every hard rule.</w:t>
+        <w:t>The GA always produces something, even where the ILP produces nothing — on Instance 8 and 12 it returns a best-of-10-seeds roster (11,753 and 28,619 respectively), even though every one of those GA runs is itself infeasible (0% feasibility rate on both). This is exactly the trade-off the theory predicts: the heuristic never times out with a blank page, but it also offers no guarantee the result obeys every hard rule.</w:t>
       </w:r>
     </w:p>
     <w:p>
@@ -14997,15 +13862,7 @@
         <w:pStyle w:val="ListNumber"/>
       </w:pPr>
       <w:r>
-        <w:t xml:space="preserve">GA feasibility collapses almost everywhere except the smallest instance: 100% of Instance 1's GA runs are feasible, only 50% of Instance 2's are, and 0% feasible from Instance 3 upward. With the current frozen parameters, the GA is not yet reliably respecting the hard rules once the instance has more than roughly 400 binary variables — </w:t>
-      </w:r>
-      <w:proofErr w:type="gramStart"/>
-      <w:r>
-        <w:t>this points</w:t>
-      </w:r>
-      <w:proofErr w:type="gramEnd"/>
-      <w:r>
-        <w:t xml:space="preserve"> at ρ (the penalty coefficient) or the operator design as the next thing to tune, not at the overall approach being wrong.</w:t>
+        <w:t>GA feasibility collapses almost everywhere except the smallest instance: 100% of Instance 1's GA runs are feasible, only 50% of Instance 2's are, and 0% feasible from Instance 3 upward. With the current frozen parameters, the GA is not yet reliably respecting the hard rules once the instance has more than roughly 400 binary variables — this points at ρ (the penalty coefficient) or the operator design as the next thing to tune, not at the overall approach being wrong.</w:t>
       </w:r>
     </w:p>
     <w:p>
@@ -15076,15 +13933,7 @@
         <w:pStyle w:val="ListNumber"/>
       </w:pPr>
       <w:r>
-        <w:t xml:space="preserve">Quality and feasibility are two separate questions, and the GA's reported “best” numbers need the feasibility rate read alongside them, not instead of it. On Instance 2 the 1,952 best-of-10 </w:t>
-      </w:r>
-      <w:proofErr w:type="gramStart"/>
-      <w:r>
-        <w:t>figure</w:t>
-      </w:r>
-      <w:proofErr w:type="gramEnd"/>
-      <w:r>
-        <w:t xml:space="preserve"> came from only 5 of 10 feasible seeds; past Instance 2, zero seeds were feasible on any instance, so every GA “best” value from Instance 3 onward is the least-bad infeasible roster, not a legal one — a gap percentage alone would hide this.</w:t>
+        <w:t>Quality and feasibility are two separate questions, and the GA's reported “best” numbers need the feasibility rate read alongside them, not instead of it. On Instance 2 the 1,952 best-of-10 figure came from only 5 of 10 feasible seeds; past Instance 2, zero seeds were feasible on any instance, so every GA “best” value from Instance 3 onward is the least-bad infeasible roster, not a legal one — a gap percentage alone would hide this.</w:t>
       </w:r>
     </w:p>
     <w:p>
@@ -15101,15 +13950,7 @@
         <w:pStyle w:val="ListNumber"/>
       </w:pPr>
       <w:r>
-        <w:t xml:space="preserve">Overall: the exact method is the stronger choice wherever it can finish (Instances 1–2, and arguably 3 for a “matches best-known, unproven” answer), while the heuristic's real — if currently limited — value only shows once the exact method produces no answer at all (Instances 8 and 12). Its own answers there still </w:t>
-      </w:r>
-      <w:proofErr w:type="gramStart"/>
-      <w:r>
-        <w:t>need</w:t>
-      </w:r>
-      <w:proofErr w:type="gramEnd"/>
-      <w:r>
-        <w:t xml:space="preserve"> the caveat that they do not yet respect every hard rule, so further GA tuning is needed before treating those numbers as a finished result.</w:t>
+        <w:t>Overall: the exact method is the stronger choice wherever it can finish (Instances 1–2, and arguably 3 for a “matches best-known, unproven” answer), while the heuristic's real — if currently limited — value only shows once the exact method produces no answer at all (Instances 8 and 12). Its own answers there still need the caveat that they do not yet respect every hard rule, so further GA tuning is needed before treating those numbers as a finished result.</w:t>
       </w:r>
     </w:p>
     <w:p>
@@ -15434,21 +14275,7 @@
               <w:rPr>
                 <w:sz w:val="19"/>
               </w:rPr>
-              <w:t>GA fitness (</w:t>
-            </w:r>
-            <w:proofErr w:type="gramStart"/>
-            <w:r>
-              <w:rPr>
-                <w:sz w:val="19"/>
-              </w:rPr>
-              <w:t>5.3) —</w:t>
-            </w:r>
-            <w:proofErr w:type="gramEnd"/>
-            <w:r>
-              <w:rPr>
-                <w:sz w:val="19"/>
-              </w:rPr>
-              <w:t xml:space="preserve"> implemented as linear, planned as quadratic</w:t>
+              <w:t>GA fitness (5.3) — implemented as linear, planned as quadratic</w:t>
             </w:r>
           </w:p>
         </w:tc>
@@ -15563,15 +14390,7 @@
         <w:pStyle w:val="ListBullet"/>
       </w:pPr>
       <w:r>
-        <w:t xml:space="preserve">Single benchmark family: conclusions apply to the </w:t>
-      </w:r>
-      <w:proofErr w:type="spellStart"/>
-      <w:r>
-        <w:t>Curtois</w:t>
-      </w:r>
-      <w:proofErr w:type="spellEnd"/>
-      <w:r>
-        <w:t xml:space="preserve"> &amp; Qu (2014) benchmark's own rule set; other hospitals may impose further rules not modelled here.</w:t>
+        <w:t>Single benchmark family: conclusions apply to the Curtois &amp; Qu (2014) benchmark's own rule set; other hospitals may impose further rules not modelled here.</w:t>
       </w:r>
     </w:p>
     <w:p>
@@ -15605,15 +14424,7 @@
         <w:pStyle w:val="ListBullet"/>
       </w:pPr>
       <w:r>
-        <w:t xml:space="preserve">Future work: a hybrid that uses the ILP to repair or polish the best GA roster (a </w:t>
-      </w:r>
-      <w:proofErr w:type="spellStart"/>
-      <w:r>
-        <w:t>matheuristic</w:t>
-      </w:r>
-      <w:proofErr w:type="spellEnd"/>
-      <w:r>
-        <w:t>); other metaheuristics such as simulated annealing as a further baseline; warm-starting the ILP with a GA roster; more benchmark instances; and a multi-objective treatment of fairness among nurses (connecting to Lecture 13's Pareto-optimality material).</w:t>
+        <w:t>Future work: a hybrid that uses the ILP to repair or polish the best GA roster (a matheuristic); other metaheuristics such as simulated annealing as a further baseline; warm-starting the ILP with a GA roster; more benchmark instances; and a multi-objective treatment of fairness among nurses (connecting to Lecture 13's Pareto-optimality material).</w:t>
       </w:r>
     </w:p>
     <w:p>
@@ -15667,15 +14478,7 @@
         <w:pStyle w:val="ListBullet"/>
       </w:pPr>
       <w:r>
-        <w:t xml:space="preserve">Re-run the GA scalability experiments with the time budget </w:t>
-      </w:r>
-      <w:proofErr w:type="gramStart"/>
-      <w:r>
-        <w:t>actually equal</w:t>
-      </w:r>
-      <w:proofErr w:type="gramEnd"/>
-      <w:r>
-        <w:t xml:space="preserve"> to the ILP's (300 s instead of the 20 s confirmed in Section 6.3), then regenerate Sections 7 and 8's tables, figures and findings 5–7 from the corrected results. This is the most consequential open item: it may materially change the feasibility-rate and runtime findings, and it is needed to answer RQ4 as originally posed.</w:t>
+        <w:t>Re-run the GA scalability experiments with the time budget actually equal to the ILP's (300 s instead of the 20 s confirmed in Section 6.3), then regenerate Sections 7 and 8's tables, figures and findings 5–7 from the corrected results. This is the most consequential open item: it may materially change the feasibility-rate and runtime findings, and it is needed to answer RQ4 as originally posed.</w:t>
       </w:r>
     </w:p>
     <w:p>
@@ -15693,31 +14496,7 @@
         <w:pStyle w:val="ListBullet"/>
       </w:pPr>
       <w:r>
-        <w:t xml:space="preserve">Reconcile the fitness function: either update the methodology document to describe the linear penalty </w:t>
-      </w:r>
-      <w:proofErr w:type="spellStart"/>
-      <w:r>
-        <w:t>ρΣV</w:t>
-      </w:r>
-      <w:proofErr w:type="spellEnd"/>
-      <w:r>
-        <w:t xml:space="preserve"> </w:t>
-      </w:r>
-      <w:proofErr w:type="gramStart"/>
-      <w:r>
-        <w:t>actually implemented</w:t>
-      </w:r>
-      <w:proofErr w:type="gramEnd"/>
-      <w:r>
-        <w:t xml:space="preserve"> (Section 5.3</w:t>
-      </w:r>
-      <w:proofErr w:type="gramStart"/>
-      <w:r>
-        <w:t>), or</w:t>
-      </w:r>
-      <w:proofErr w:type="gramEnd"/>
-      <w:r>
-        <w:t xml:space="preserve"> change the code to the quadratic ρΣV² originally planned and re-run the affected experiments. Either is defensible; leaving the document and the code silently disagreeing is not.</w:t>
+        <w:t>Reconcile the fitness function: either update the methodology document to describe the linear penalty ρΣV actually implemented (Section 5.3), or change the code to the quadratic ρΣV² originally planned and re-run the affected experiments. Either is defensible; leaving the document and the code silently disagreeing is not.</w:t>
       </w:r>
     </w:p>
     <w:p>
@@ -15752,15 +14531,7 @@
         <w:pStyle w:val="ListBullet"/>
       </w:pPr>
       <w:r>
-        <w:t xml:space="preserve">Minor: the time_to_within_5pct column exists in ga_results.csv but was never populated or </w:t>
-      </w:r>
-      <w:proofErr w:type="spellStart"/>
-      <w:r>
-        <w:t>analysed</w:t>
-      </w:r>
-      <w:proofErr w:type="spellEnd"/>
-      <w:r>
-        <w:t xml:space="preserve"> — either compute it (it would add a useful “time to a good-enough answer” metric alongside “time to the literal best”) or drop the unused column.</w:t>
+        <w:t>Minor: the time_to_within_5pct column exists in ga_results.csv but was never populated or analysed — either compute it (it would add a useful “time to a good-enough answer” metric alongside “time to the literal best”) or drop the unused column.</w:t>
       </w:r>
     </w:p>
     <w:p>
@@ -15822,23 +14593,7 @@
     <w:p/>
     <w:p>
       <w:r>
-        <w:t xml:space="preserve">Before this report and its code appendix are </w:t>
-      </w:r>
-      <w:proofErr w:type="spellStart"/>
-      <w:r>
-        <w:t>finalised</w:t>
-      </w:r>
-      <w:proofErr w:type="spellEnd"/>
-      <w:r>
-        <w:t xml:space="preserve">, the team still needs to: (1) re-run the GA scalability experiments at a true 300-second budget and update Sections 6–8 accordingly; (2) reconcile the linear-versus-quadratic penalty discrepancy between the plan and the implementation; (3) either compute or formally drop the shadow-price analysis; (4) record both members' Day 7 video segments and combine them into the 15-minute submission video; and (5) assemble members.txt, submission.txt and the plain-text code appendix into the final Optimization-assignment.zip. With those items closed, the project will have delivered on both halves of the assignment brief: a correct, verified exact method, and a working, honestly evaluated metaheuristic, compared </w:t>
-      </w:r>
-      <w:proofErr w:type="gramStart"/>
-      <w:r>
-        <w:t>on</w:t>
-      </w:r>
-      <w:proofErr w:type="gramEnd"/>
-      <w:r>
-        <w:t xml:space="preserve"> the same real benchmark data.</w:t>
+        <w:t>Before this report and its code appendix are finalised, the team still needs to: (1) re-run the GA scalability experiments at a true 300-second budget and update Sections 6–8 accordingly; (2) reconcile the linear-versus-quadratic penalty discrepancy between the plan and the implementation; (3) either compute or formally drop the shadow-price analysis; (4) record both members' Day 7 video segments and combine them into the 15-minute submission video; and (5) assemble members.txt, submission.txt and the plain-text code appendix into the final Optimization-assignment.zip. With those items closed, the project will have delivered on both halves of the assignment brief: a correct, verified exact method, and a working, honestly evaluated metaheuristic, compared on the same real benchmark data.</w:t>
       </w:r>
     </w:p>
     <w:p>
@@ -15893,21 +14648,7 @@
         <w:rPr>
           <w:sz w:val="21"/>
         </w:rPr>
-        <w:t xml:space="preserve">T. </w:t>
-      </w:r>
-      <w:proofErr w:type="spellStart"/>
-      <w:r>
-        <w:rPr>
-          <w:sz w:val="21"/>
-        </w:rPr>
-        <w:t>Curtois</w:t>
-      </w:r>
-      <w:proofErr w:type="spellEnd"/>
-      <w:r>
-        <w:rPr>
-          <w:sz w:val="21"/>
-        </w:rPr>
-        <w:t xml:space="preserve"> and R. Qu, Computational results on new staff scheduling benchmark instances, Technical Report, ASAP Research Group, University of Nottingham, 2014. </w:t>
+        <w:t xml:space="preserve">T. Curtois and R. Qu, Computational results on new staff scheduling benchmark instances, Technical Report, ASAP Research Group, University of Nottingham, 2014. </w:t>
       </w:r>
       <w:hyperlink r:id="rId17" w:history="1">
         <w:r>
@@ -15937,21 +14678,7 @@
         <w:rPr>
           <w:sz w:val="21"/>
         </w:rPr>
-        <w:t xml:space="preserve">E. K. Burke, P. De Causmaecker, G. Vanden Berghe and H. Van </w:t>
-      </w:r>
-      <w:proofErr w:type="spellStart"/>
-      <w:r>
-        <w:rPr>
-          <w:sz w:val="21"/>
-        </w:rPr>
-        <w:t>Landeghem</w:t>
-      </w:r>
-      <w:proofErr w:type="spellEnd"/>
-      <w:r>
-        <w:rPr>
-          <w:sz w:val="21"/>
-        </w:rPr>
-        <w:t>, The state of the art of nurse rostering, Journal of Scheduling, 7(6):441–499, 2004.</w:t>
+        <w:t>E. K. Burke, P. De Causmaecker, G. Vanden Berghe and H. Van Landeghem, The state of the art of nurse rostering, Journal of Scheduling, 7(6):441–499, 2004.</w:t>
       </w:r>
     </w:p>
     <w:p>
@@ -15993,21 +14720,7 @@
         <w:rPr>
           <w:sz w:val="21"/>
         </w:rPr>
-        <w:t xml:space="preserve">G. L. </w:t>
-      </w:r>
-      <w:proofErr w:type="spellStart"/>
-      <w:r>
-        <w:rPr>
-          <w:sz w:val="21"/>
-        </w:rPr>
-        <w:t>Nemhauser</w:t>
-      </w:r>
-      <w:proofErr w:type="spellEnd"/>
-      <w:r>
-        <w:rPr>
-          <w:sz w:val="21"/>
-        </w:rPr>
-        <w:t xml:space="preserve"> and L. A. Wolsey, Integer and Combinatorial Optimization, Wiley, 1988.</w:t>
+        <w:t>G. L. Nemhauser and L. A. Wolsey, Integer and Combinatorial Optimization, Wiley, 1988.</w:t>
       </w:r>
     </w:p>
     <w:p>

</xml_diff>